<commit_message>
Keep template match box out of the next processing input
Template matching drew the red box into ResultBitmap, and the next step
(e.g. DIFF then CORR) used that image as input, leaving two boxes and
letting the old box pixels affect the score. Store the image before the
box is drawn and continue processing from it.

Co-Authored-By: Claude Opus 5.5 <noreply@anthropic.com>
Claude-Session: https://claude.ai/code/session_019qMwoX24MJmDBfNA6HFSJ8
</commit_message>
<xml_diff>
--- a/docs/REFACTORING_GUIDE.docx
+++ b/docs/REFACTORING_GUIDE.docx
@@ -15033,6 +15033,526 @@
       </w:r>
       <w:r>
         <w:t xml:space="preserve"> 로 결과가 지워져서 처음부터 다시 시작한다.</w:t>
+      </w:r>
+    </w:p>
+    <w:p>
+      <w:pPr>
+        <w:spacing w:after="120"/>
+      </w:pPr>
+      <w:r>
+        <w:rPr>
+          <w:b/>
+          <w:bCs/>
+        </w:rPr>
+        <w:t xml:space="preserve">템플릿 매칭 결과는 예외</w:t>
+      </w:r>
+      <w:r>
+        <w:t xml:space="preserve"> : 매칭 결과(</w:t>
+      </w:r>
+      <w:r>
+        <w:rPr>
+          <w:rFonts w:ascii="Consolas" w:eastAsia="맑은 고딕" w:hAnsi="Consolas"/>
+          <w:color w:val="A31515"/>
+          <w:shd w:fill="F2F2F2" w:color="auto" w:val="clear"/>
+        </w:rPr>
+        <w:t xml:space="preserve">ResultBitmap</w:t>
+      </w:r>
+      <w:r>
+        <w:t xml:space="preserve">)에는 빨간 사각형이 픽셀로 그려져 있다.</w:t>
+      </w:r>
+      <w:r>
+        <w:br/>
+      </w:r>
+      <w:r>
+        <w:t xml:space="preserve">이것을 그대로 다음 입력으로 쓰면 DIFF → CORR 순서로 눌렀을 때 사각형이 두 개 남고,</w:t>
+      </w:r>
+      <w:r>
+        <w:br/>
+      </w:r>
+      <w:r>
+        <w:t xml:space="preserve">이전 사각형의 빨간 픽셀이 CORR 점수 계산에도 섞여 버린다.</w:t>
+      </w:r>
+      <w:r>
+        <w:br/>
+      </w:r>
+      <w:r>
+        <w:t xml:space="preserve">그래서 </w:t>
+      </w:r>
+      <w:r>
+        <w:rPr>
+          <w:rFonts w:ascii="Consolas" w:eastAsia="맑은 고딕" w:hAnsi="Consolas"/>
+          <w:color w:val="A31515"/>
+          <w:shd w:fill="F2F2F2" w:color="auto" w:val="clear"/>
+        </w:rPr>
+        <w:t xml:space="preserve">SaveMatchResult</w:t>
+      </w:r>
+      <w:r>
+        <w:t xml:space="preserve"> 는 사각형을 그리기 </w:t>
+      </w:r>
+      <w:r>
+        <w:rPr>
+          <w:b/>
+          <w:bCs/>
+        </w:rPr>
+        <w:t xml:space="preserve">전</w:t>
+      </w:r>
+      <w:r>
+        <w:t xml:space="preserve"> 영상을 </w:t>
+      </w:r>
+      <w:r>
+        <w:rPr>
+          <w:rFonts w:ascii="Consolas" w:eastAsia="맑은 고딕" w:hAnsi="Consolas"/>
+          <w:color w:val="A31515"/>
+          <w:shd w:fill="F2F2F2" w:color="auto" w:val="clear"/>
+        </w:rPr>
+        <w:t xml:space="preserve">resultWithoutBox</w:t>
+      </w:r>
+      <w:r>
+        <w:t xml:space="preserve"> 에 따로 보관하고,</w:t>
+      </w:r>
+      <w:r>
+        <w:br/>
+      </w:r>
+      <w:r>
+        <w:rPr>
+          <w:rFonts w:ascii="Consolas" w:eastAsia="맑은 고딕" w:hAnsi="Consolas"/>
+          <w:color w:val="A31515"/>
+          <w:shd w:fill="F2F2F2" w:color="auto" w:val="clear"/>
+        </w:rPr>
+        <w:t xml:space="preserve">CopyProcessingSource</w:t>
+      </w:r>
+      <w:r>
+        <w:t xml:space="preserve"> 는 이 값이 있으면 사각형 없는 영상으로 이어서 처리한다.</w:t>
+      </w:r>
+    </w:p>
+    <w:tbl>
+      <w:tblPr>
+        <w:tblW w:type="dxa" w:w="9638"/>
+        <w:tblBorders>
+          <w:top w:val="single" w:color="auto" w:sz="4"/>
+          <w:left w:val="single" w:color="auto" w:sz="4"/>
+          <w:bottom w:val="single" w:color="auto" w:sz="4"/>
+          <w:right w:val="single" w:color="auto" w:sz="4"/>
+          <w:insideH w:val="single" w:color="auto" w:sz="4"/>
+          <w:insideV w:val="single" w:color="auto" w:sz="4"/>
+        </w:tblBorders>
+      </w:tblPr>
+      <w:tblGrid>
+        <w:gridCol w:w="3147"/>
+        <w:gridCol w:w="3147"/>
+        <w:gridCol w:w="3344"/>
+      </w:tblGrid>
+      <w:tr>
+        <w:trPr>
+          <w:tblHeader/>
+        </w:trPr>
+        <w:tc>
+          <w:tcPr>
+            <w:tcW w:type="dxa" w:w="3147"/>
+            <w:tcBorders>
+              <w:top w:val="single" w:color="BFBFBF" w:sz="4"/>
+              <w:left w:val="single" w:color="BFBFBF" w:sz="4"/>
+              <w:bottom w:val="single" w:color="BFBFBF" w:sz="4"/>
+              <w:right w:val="single" w:color="BFBFBF" w:sz="4"/>
+            </w:tcBorders>
+            <w:shd w:fill="DEEAF6" w:color="auto" w:val="clear"/>
+            <w:tcMar>
+              <w:top w:type="dxa" w:w="60"/>
+              <w:left w:type="dxa" w:w="100"/>
+              <w:bottom w:type="dxa" w:w="60"/>
+              <w:right w:type="dxa" w:w="100"/>
+            </w:tcMar>
+          </w:tcPr>
+          <w:p>
+            <w:pPr>
+              <w:spacing w:after="0" w:before="0"/>
+            </w:pPr>
+            <w:r>
+              <w:rPr>
+                <w:b/>
+                <w:bCs/>
+                <w:sz w:val="18"/>
+                <w:szCs w:val="18"/>
+              </w:rPr>
+              <w:t xml:space="preserve">순서</w:t>
+            </w:r>
+          </w:p>
+        </w:tc>
+        <w:tc>
+          <w:tcPr>
+            <w:tcW w:type="dxa" w:w="3147"/>
+            <w:tcBorders>
+              <w:top w:val="single" w:color="BFBFBF" w:sz="4"/>
+              <w:left w:val="single" w:color="BFBFBF" w:sz="4"/>
+              <w:bottom w:val="single" w:color="BFBFBF" w:sz="4"/>
+              <w:right w:val="single" w:color="BFBFBF" w:sz="4"/>
+            </w:tcBorders>
+            <w:shd w:fill="DEEAF6" w:color="auto" w:val="clear"/>
+            <w:tcMar>
+              <w:top w:type="dxa" w:w="60"/>
+              <w:left w:type="dxa" w:w="100"/>
+              <w:bottom w:type="dxa" w:w="60"/>
+              <w:right w:type="dxa" w:w="100"/>
+            </w:tcMar>
+          </w:tcPr>
+          <w:p>
+            <w:pPr>
+              <w:spacing w:after="0" w:before="0"/>
+            </w:pPr>
+            <w:r>
+              <w:rPr>
+                <w:b/>
+                <w:bCs/>
+                <w:sz w:val="18"/>
+                <w:szCs w:val="18"/>
+              </w:rPr>
+              <w:t xml:space="preserve">다음 처리의 입력</w:t>
+            </w:r>
+          </w:p>
+        </w:tc>
+        <w:tc>
+          <w:tcPr>
+            <w:tcW w:type="dxa" w:w="3344"/>
+            <w:tcBorders>
+              <w:top w:val="single" w:color="BFBFBF" w:sz="4"/>
+              <w:left w:val="single" w:color="BFBFBF" w:sz="4"/>
+              <w:bottom w:val="single" w:color="BFBFBF" w:sz="4"/>
+              <w:right w:val="single" w:color="BFBFBF" w:sz="4"/>
+            </w:tcBorders>
+            <w:shd w:fill="DEEAF6" w:color="auto" w:val="clear"/>
+            <w:tcMar>
+              <w:top w:type="dxa" w:w="60"/>
+              <w:left w:type="dxa" w:w="100"/>
+              <w:bottom w:type="dxa" w:w="60"/>
+              <w:right w:type="dxa" w:w="100"/>
+            </w:tcMar>
+          </w:tcPr>
+          <w:p>
+            <w:pPr>
+              <w:spacing w:after="0" w:before="0"/>
+            </w:pPr>
+            <w:r>
+              <w:rPr>
+                <w:b/>
+                <w:bCs/>
+                <w:sz w:val="18"/>
+                <w:szCs w:val="18"/>
+              </w:rPr>
+              <w:t xml:space="preserve">화면(Viewer2)</w:t>
+            </w:r>
+          </w:p>
+        </w:tc>
+      </w:tr>
+      <w:tr>
+        <w:trPr>
+          <w:tblHeader w:val="off"/>
+        </w:trPr>
+        <w:tc>
+          <w:tcPr>
+            <w:tcW w:type="dxa" w:w="3147"/>
+            <w:tcBorders>
+              <w:top w:val="single" w:color="BFBFBF" w:sz="4"/>
+              <w:left w:val="single" w:color="BFBFBF" w:sz="4"/>
+              <w:bottom w:val="single" w:color="BFBFBF" w:sz="4"/>
+              <w:right w:val="single" w:color="BFBFBF" w:sz="4"/>
+            </w:tcBorders>
+            <w:tcMar>
+              <w:top w:type="dxa" w:w="60"/>
+              <w:left w:type="dxa" w:w="100"/>
+              <w:bottom w:type="dxa" w:w="60"/>
+              <w:right w:type="dxa" w:w="100"/>
+            </w:tcMar>
+          </w:tcPr>
+          <w:p>
+            <w:pPr>
+              <w:spacing w:after="0" w:before="0"/>
+            </w:pPr>
+            <w:r>
+              <w:rPr>
+                <w:sz w:val="18"/>
+                <w:szCs w:val="18"/>
+              </w:rPr>
+              <w:t xml:space="preserve">DIFF</w:t>
+            </w:r>
+          </w:p>
+        </w:tc>
+        <w:tc>
+          <w:tcPr>
+            <w:tcW w:type="dxa" w:w="3147"/>
+            <w:tcBorders>
+              <w:top w:val="single" w:color="BFBFBF" w:sz="4"/>
+              <w:left w:val="single" w:color="BFBFBF" w:sz="4"/>
+              <w:bottom w:val="single" w:color="BFBFBF" w:sz="4"/>
+              <w:right w:val="single" w:color="BFBFBF" w:sz="4"/>
+            </w:tcBorders>
+            <w:tcMar>
+              <w:top w:type="dxa" w:w="60"/>
+              <w:left w:type="dxa" w:w="100"/>
+              <w:bottom w:type="dxa" w:w="60"/>
+              <w:right w:type="dxa" w:w="100"/>
+            </w:tcMar>
+          </w:tcPr>
+          <w:p>
+            <w:pPr>
+              <w:spacing w:after="0" w:before="0"/>
+            </w:pPr>
+            <w:r>
+              <w:rPr>
+                <w:sz w:val="18"/>
+                <w:szCs w:val="18"/>
+              </w:rPr>
+              <w:t xml:space="preserve">원본</w:t>
+            </w:r>
+          </w:p>
+        </w:tc>
+        <w:tc>
+          <w:tcPr>
+            <w:tcW w:type="dxa" w:w="3344"/>
+            <w:tcBorders>
+              <w:top w:val="single" w:color="BFBFBF" w:sz="4"/>
+              <w:left w:val="single" w:color="BFBFBF" w:sz="4"/>
+              <w:bottom w:val="single" w:color="BFBFBF" w:sz="4"/>
+              <w:right w:val="single" w:color="BFBFBF" w:sz="4"/>
+            </w:tcBorders>
+            <w:tcMar>
+              <w:top w:type="dxa" w:w="60"/>
+              <w:left w:type="dxa" w:w="100"/>
+              <w:bottom w:type="dxa" w:w="60"/>
+              <w:right w:type="dxa" w:w="100"/>
+            </w:tcMar>
+          </w:tcPr>
+          <w:p>
+            <w:pPr>
+              <w:spacing w:after="0" w:before="0"/>
+            </w:pPr>
+            <w:r>
+              <w:rPr>
+                <w:sz w:val="18"/>
+                <w:szCs w:val="18"/>
+              </w:rPr>
+              <w:t xml:space="preserve">원본 + DIFF 사각형</w:t>
+            </w:r>
+          </w:p>
+        </w:tc>
+      </w:tr>
+      <w:tr>
+        <w:trPr>
+          <w:tblHeader w:val="off"/>
+        </w:trPr>
+        <w:tc>
+          <w:tcPr>
+            <w:tcW w:type="dxa" w:w="3147"/>
+            <w:tcBorders>
+              <w:top w:val="single" w:color="BFBFBF" w:sz="4"/>
+              <w:left w:val="single" w:color="BFBFBF" w:sz="4"/>
+              <w:bottom w:val="single" w:color="BFBFBF" w:sz="4"/>
+              <w:right w:val="single" w:color="BFBFBF" w:sz="4"/>
+            </w:tcBorders>
+            <w:tcMar>
+              <w:top w:type="dxa" w:w="60"/>
+              <w:left w:type="dxa" w:w="100"/>
+              <w:bottom w:type="dxa" w:w="60"/>
+              <w:right w:type="dxa" w:w="100"/>
+            </w:tcMar>
+          </w:tcPr>
+          <w:p>
+            <w:pPr>
+              <w:spacing w:after="0" w:before="0"/>
+            </w:pPr>
+            <w:r>
+              <w:rPr>
+                <w:sz w:val="18"/>
+                <w:szCs w:val="18"/>
+              </w:rPr>
+              <w:t xml:space="preserve">→ CORR</w:t>
+            </w:r>
+          </w:p>
+        </w:tc>
+        <w:tc>
+          <w:tcPr>
+            <w:tcW w:type="dxa" w:w="3147"/>
+            <w:tcBorders>
+              <w:top w:val="single" w:color="BFBFBF" w:sz="4"/>
+              <w:left w:val="single" w:color="BFBFBF" w:sz="4"/>
+              <w:bottom w:val="single" w:color="BFBFBF" w:sz="4"/>
+              <w:right w:val="single" w:color="BFBFBF" w:sz="4"/>
+            </w:tcBorders>
+            <w:tcMar>
+              <w:top w:type="dxa" w:w="60"/>
+              <w:left w:type="dxa" w:w="100"/>
+              <w:bottom w:type="dxa" w:w="60"/>
+              <w:right w:type="dxa" w:w="100"/>
+            </w:tcMar>
+          </w:tcPr>
+          <w:p>
+            <w:pPr>
+              <w:spacing w:after="0" w:before="0"/>
+            </w:pPr>
+            <w:r>
+              <w:rPr>
+                <w:sz w:val="18"/>
+                <w:szCs w:val="18"/>
+              </w:rPr>
+              <w:t xml:space="preserve">원본 (사각형 없음)</w:t>
+            </w:r>
+          </w:p>
+        </w:tc>
+        <w:tc>
+          <w:tcPr>
+            <w:tcW w:type="dxa" w:w="3344"/>
+            <w:tcBorders>
+              <w:top w:val="single" w:color="BFBFBF" w:sz="4"/>
+              <w:left w:val="single" w:color="BFBFBF" w:sz="4"/>
+              <w:bottom w:val="single" w:color="BFBFBF" w:sz="4"/>
+              <w:right w:val="single" w:color="BFBFBF" w:sz="4"/>
+            </w:tcBorders>
+            <w:tcMar>
+              <w:top w:type="dxa" w:w="60"/>
+              <w:left w:type="dxa" w:w="100"/>
+              <w:bottom w:type="dxa" w:w="60"/>
+              <w:right w:type="dxa" w:w="100"/>
+            </w:tcMar>
+          </w:tcPr>
+          <w:p>
+            <w:pPr>
+              <w:spacing w:after="0" w:before="0"/>
+            </w:pPr>
+            <w:r>
+              <w:rPr>
+                <w:sz w:val="18"/>
+                <w:szCs w:val="18"/>
+              </w:rPr>
+              <w:t xml:space="preserve">원본 + CORR 사각형 1개만</w:t>
+            </w:r>
+          </w:p>
+        </w:tc>
+      </w:tr>
+      <w:tr>
+        <w:trPr>
+          <w:tblHeader w:val="off"/>
+        </w:trPr>
+        <w:tc>
+          <w:tcPr>
+            <w:tcW w:type="dxa" w:w="3147"/>
+            <w:tcBorders>
+              <w:top w:val="single" w:color="BFBFBF" w:sz="4"/>
+              <w:left w:val="single" w:color="BFBFBF" w:sz="4"/>
+              <w:bottom w:val="single" w:color="BFBFBF" w:sz="4"/>
+              <w:right w:val="single" w:color="BFBFBF" w:sz="4"/>
+            </w:tcBorders>
+            <w:tcMar>
+              <w:top w:type="dxa" w:w="60"/>
+              <w:left w:type="dxa" w:w="100"/>
+              <w:bottom w:type="dxa" w:w="60"/>
+              <w:right w:type="dxa" w:w="100"/>
+            </w:tcMar>
+          </w:tcPr>
+          <w:p>
+            <w:pPr>
+              <w:spacing w:after="0" w:before="0"/>
+            </w:pPr>
+            <w:r>
+              <w:rPr>
+                <w:sz w:val="18"/>
+                <w:szCs w:val="18"/>
+              </w:rPr>
+              <w:t xml:space="preserve">가우시안 → DIFF → 소벨</w:t>
+            </w:r>
+          </w:p>
+        </w:tc>
+        <w:tc>
+          <w:tcPr>
+            <w:tcW w:type="dxa" w:w="3147"/>
+            <w:tcBorders>
+              <w:top w:val="single" w:color="BFBFBF" w:sz="4"/>
+              <w:left w:val="single" w:color="BFBFBF" w:sz="4"/>
+              <w:bottom w:val="single" w:color="BFBFBF" w:sz="4"/>
+              <w:right w:val="single" w:color="BFBFBF" w:sz="4"/>
+            </w:tcBorders>
+            <w:tcMar>
+              <w:top w:type="dxa" w:w="60"/>
+              <w:left w:type="dxa" w:w="100"/>
+              <w:bottom w:type="dxa" w:w="60"/>
+              <w:right w:type="dxa" w:w="100"/>
+            </w:tcMar>
+          </w:tcPr>
+          <w:p>
+            <w:pPr>
+              <w:spacing w:after="0" w:before="0"/>
+            </w:pPr>
+            <w:r>
+              <w:rPr>
+                <w:sz w:val="18"/>
+                <w:szCs w:val="18"/>
+              </w:rPr>
+              <w:t xml:space="preserve">가우시안 결과 (사각형 없음)</w:t>
+            </w:r>
+          </w:p>
+        </w:tc>
+        <w:tc>
+          <w:tcPr>
+            <w:tcW w:type="dxa" w:w="3344"/>
+            <w:tcBorders>
+              <w:top w:val="single" w:color="BFBFBF" w:sz="4"/>
+              <w:left w:val="single" w:color="BFBFBF" w:sz="4"/>
+              <w:bottom w:val="single" w:color="BFBFBF" w:sz="4"/>
+              <w:right w:val="single" w:color="BFBFBF" w:sz="4"/>
+            </w:tcBorders>
+            <w:tcMar>
+              <w:top w:type="dxa" w:w="60"/>
+              <w:left w:type="dxa" w:w="100"/>
+              <w:bottom w:type="dxa" w:w="60"/>
+              <w:right w:type="dxa" w:w="100"/>
+            </w:tcMar>
+          </w:tcPr>
+          <w:p>
+            <w:pPr>
+              <w:spacing w:after="0" w:before="0"/>
+            </w:pPr>
+            <w:r>
+              <w:rPr>
+                <w:sz w:val="18"/>
+                <w:szCs w:val="18"/>
+              </w:rPr>
+              <w:t xml:space="preserve">가우시안 + 소벨 결과</w:t>
+            </w:r>
+          </w:p>
+        </w:tc>
+      </w:tr>
+    </w:tbl>
+    <w:p>
+      <w:pPr>
+        <w:spacing w:after="80"/>
+      </w:pPr>
+    </w:p>
+    <w:p>
+      <w:pPr>
+        <w:spacing w:after="120"/>
+      </w:pPr>
+      <w:r>
+        <w:t xml:space="preserve">다른 처리가 실행되면 </w:t>
+      </w:r>
+      <w:r>
+        <w:rPr>
+          <w:rFonts w:ascii="Consolas" w:eastAsia="맑은 고딕" w:hAnsi="Consolas"/>
+          <w:color w:val="A31515"/>
+          <w:shd w:fill="F2F2F2" w:color="auto" w:val="clear"/>
+        </w:rPr>
+        <w:t xml:space="preserve">ReplaceResult</w:t>
+      </w:r>
+      <w:r>
+        <w:t xml:space="preserve"> 가 </w:t>
+      </w:r>
+      <w:r>
+        <w:rPr>
+          <w:rFonts w:ascii="Consolas" w:eastAsia="맑은 고딕" w:hAnsi="Consolas"/>
+          <w:color w:val="A31515"/>
+          <w:shd w:fill="F2F2F2" w:color="auto" w:val="clear"/>
+        </w:rPr>
+        <w:t xml:space="preserve">resultWithoutBox</w:t>
+      </w:r>
+      <w:r>
+        <w:t xml:space="preserve"> 를 지운다. (새 결과에는 사각형이 없으므로)</w:t>
       </w:r>
     </w:p>
     <w:p>

</xml_diff>

<commit_message>
Show ROI on Viewer2 and label histogram target/range
- Add ResultCanvas/ResultRoiRect overlay on Viewer2
- Replace UpdateNavigatorRoi with UpdateRoiMarks + ShowRoiOnCanvas for
  Viewer1, Viewer2 and Navigator; redraw on canvas resize
- Histogram header now reads '대상 : 원본/처리 결과 | 범위 : 전체/ROI 영역'
- Update guide (md/docx)

Co-Authored-By: Claude Opus 5.5 <noreply@anthropic.com>
Claude-Session: https://claude.ai/code/session_019qMwoX24MJmDBfNA6HFSJ8
</commit_message>
<xml_diff>
--- a/docs/REFACTORING_GUIDE.docx
+++ b/docs/REFACTORING_GUIDE.docx
@@ -4183,9 +4183,9 @@
         </w:tblBorders>
       </w:tblPr>
       <w:tblGrid>
-        <w:gridCol w:w="4216"/>
-        <w:gridCol w:w="3252"/>
-        <w:gridCol w:w="2170"/>
+        <w:gridCol w:w="3275"/>
+        <w:gridCol w:w="2620"/>
+        <w:gridCol w:w="3743"/>
       </w:tblGrid>
       <w:tr>
         <w:trPr>
@@ -4193,7 +4193,7 @@
         </w:trPr>
         <w:tc>
           <w:tcPr>
-            <w:tcW w:type="dxa" w:w="4216"/>
+            <w:tcW w:type="dxa" w:w="3275"/>
             <w:tcBorders>
               <w:top w:val="single" w:color="BFBFBF" w:sz="4"/>
               <w:left w:val="single" w:color="BFBFBF" w:sz="4"/>
@@ -4225,7 +4225,7 @@
         </w:tc>
         <w:tc>
           <w:tcPr>
-            <w:tcW w:type="dxa" w:w="3252"/>
+            <w:tcW w:type="dxa" w:w="2620"/>
             <w:tcBorders>
               <w:top w:val="single" w:color="BFBFBF" w:sz="4"/>
               <w:left w:val="single" w:color="BFBFBF" w:sz="4"/>
@@ -4257,7 +4257,7 @@
         </w:tc>
         <w:tc>
           <w:tcPr>
-            <w:tcW w:type="dxa" w:w="2170"/>
+            <w:tcW w:type="dxa" w:w="3743"/>
             <w:tcBorders>
               <w:top w:val="single" w:color="BFBFBF" w:sz="4"/>
               <w:left w:val="single" w:color="BFBFBF" w:sz="4"/>
@@ -4294,7 +4294,7 @@
         </w:trPr>
         <w:tc>
           <w:tcPr>
-            <w:tcW w:type="dxa" w:w="4216"/>
+            <w:tcW w:type="dxa" w:w="3275"/>
             <w:tcBorders>
               <w:top w:val="single" w:color="BFBFBF" w:sz="4"/>
               <w:left w:val="single" w:color="BFBFBF" w:sz="4"/>
@@ -4323,7 +4323,7 @@
         </w:tc>
         <w:tc>
           <w:tcPr>
-            <w:tcW w:type="dxa" w:w="3252"/>
+            <w:tcW w:type="dxa" w:w="2620"/>
             <w:tcBorders>
               <w:top w:val="single" w:color="BFBFBF" w:sz="4"/>
               <w:left w:val="single" w:color="BFBFBF" w:sz="4"/>
@@ -4372,7 +4372,7 @@
         </w:tc>
         <w:tc>
           <w:tcPr>
-            <w:tcW w:type="dxa" w:w="2170"/>
+            <w:tcW w:type="dxa" w:w="3743"/>
             <w:tcBorders>
               <w:top w:val="single" w:color="BFBFBF" w:sz="4"/>
               <w:left w:val="single" w:color="BFBFBF" w:sz="4"/>
@@ -4406,7 +4406,7 @@
         </w:trPr>
         <w:tc>
           <w:tcPr>
-            <w:tcW w:type="dxa" w:w="4216"/>
+            <w:tcW w:type="dxa" w:w="3275"/>
             <w:tcBorders>
               <w:top w:val="single" w:color="BFBFBF" w:sz="4"/>
               <w:left w:val="single" w:color="BFBFBF" w:sz="4"/>
@@ -4435,7 +4435,7 @@
         </w:tc>
         <w:tc>
           <w:tcPr>
-            <w:tcW w:type="dxa" w:w="3252"/>
+            <w:tcW w:type="dxa" w:w="2620"/>
             <w:tcBorders>
               <w:top w:val="single" w:color="BFBFBF" w:sz="4"/>
               <w:left w:val="single" w:color="BFBFBF" w:sz="4"/>
@@ -4467,7 +4467,7 @@
         </w:tc>
         <w:tc>
           <w:tcPr>
-            <w:tcW w:type="dxa" w:w="2170"/>
+            <w:tcW w:type="dxa" w:w="3743"/>
             <w:tcBorders>
               <w:top w:val="single" w:color="BFBFBF" w:sz="4"/>
               <w:left w:val="single" w:color="BFBFBF" w:sz="4"/>
@@ -4501,7 +4501,7 @@
         </w:trPr>
         <w:tc>
           <w:tcPr>
-            <w:tcW w:type="dxa" w:w="4216"/>
+            <w:tcW w:type="dxa" w:w="3275"/>
             <w:tcBorders>
               <w:top w:val="single" w:color="BFBFBF" w:sz="4"/>
               <w:left w:val="single" w:color="BFBFBF" w:sz="4"/>
@@ -4530,7 +4530,7 @@
         </w:tc>
         <w:tc>
           <w:tcPr>
-            <w:tcW w:type="dxa" w:w="3252"/>
+            <w:tcW w:type="dxa" w:w="2620"/>
             <w:tcBorders>
               <w:top w:val="single" w:color="BFBFBF" w:sz="4"/>
               <w:left w:val="single" w:color="BFBFBF" w:sz="4"/>
@@ -4569,7 +4569,7 @@
         </w:tc>
         <w:tc>
           <w:tcPr>
-            <w:tcW w:type="dxa" w:w="2170"/>
+            <w:tcW w:type="dxa" w:w="3743"/>
             <w:tcBorders>
               <w:top w:val="single" w:color="BFBFBF" w:sz="4"/>
               <w:left w:val="single" w:color="BFBFBF" w:sz="4"/>
@@ -4603,7 +4603,7 @@
         </w:trPr>
         <w:tc>
           <w:tcPr>
-            <w:tcW w:type="dxa" w:w="4216"/>
+            <w:tcW w:type="dxa" w:w="3275"/>
             <w:tcBorders>
               <w:top w:val="single" w:color="BFBFBF" w:sz="4"/>
               <w:left w:val="single" w:color="BFBFBF" w:sz="4"/>
@@ -4632,7 +4632,7 @@
         </w:tc>
         <w:tc>
           <w:tcPr>
-            <w:tcW w:type="dxa" w:w="3252"/>
+            <w:tcW w:type="dxa" w:w="2620"/>
             <w:tcBorders>
               <w:top w:val="single" w:color="BFBFBF" w:sz="4"/>
               <w:left w:val="single" w:color="BFBFBF" w:sz="4"/>
@@ -4664,7 +4664,7 @@
         </w:tc>
         <w:tc>
           <w:tcPr>
-            <w:tcW w:type="dxa" w:w="2170"/>
+            <w:tcW w:type="dxa" w:w="3743"/>
             <w:tcBorders>
               <w:top w:val="single" w:color="BFBFBF" w:sz="4"/>
               <w:left w:val="single" w:color="BFBFBF" w:sz="4"/>
@@ -4698,7 +4698,7 @@
         </w:trPr>
         <w:tc>
           <w:tcPr>
-            <w:tcW w:type="dxa" w:w="4216"/>
+            <w:tcW w:type="dxa" w:w="3275"/>
             <w:tcBorders>
               <w:top w:val="single" w:color="BFBFBF" w:sz="4"/>
               <w:left w:val="single" w:color="BFBFBF" w:sz="4"/>
@@ -4727,7 +4727,7 @@
         </w:tc>
         <w:tc>
           <w:tcPr>
-            <w:tcW w:type="dxa" w:w="3252"/>
+            <w:tcW w:type="dxa" w:w="2620"/>
             <w:tcBorders>
               <w:top w:val="single" w:color="BFBFBF" w:sz="4"/>
               <w:left w:val="single" w:color="BFBFBF" w:sz="4"/>
@@ -4759,7 +4759,7 @@
         </w:tc>
         <w:tc>
           <w:tcPr>
-            <w:tcW w:type="dxa" w:w="2170"/>
+            <w:tcW w:type="dxa" w:w="3743"/>
             <w:tcBorders>
               <w:top w:val="single" w:color="BFBFBF" w:sz="4"/>
               <w:left w:val="single" w:color="BFBFBF" w:sz="4"/>
@@ -4793,7 +4793,7 @@
         </w:trPr>
         <w:tc>
           <w:tcPr>
-            <w:tcW w:type="dxa" w:w="4216"/>
+            <w:tcW w:type="dxa" w:w="3275"/>
             <w:tcBorders>
               <w:top w:val="single" w:color="BFBFBF" w:sz="4"/>
               <w:left w:val="single" w:color="BFBFBF" w:sz="4"/>
@@ -4822,7 +4822,7 @@
         </w:tc>
         <w:tc>
           <w:tcPr>
-            <w:tcW w:type="dxa" w:w="3252"/>
+            <w:tcW w:type="dxa" w:w="2620"/>
             <w:tcBorders>
               <w:top w:val="single" w:color="BFBFBF" w:sz="4"/>
               <w:left w:val="single" w:color="BFBFBF" w:sz="4"/>
@@ -4854,7 +4854,7 @@
         </w:tc>
         <w:tc>
           <w:tcPr>
-            <w:tcW w:type="dxa" w:w="2170"/>
+            <w:tcW w:type="dxa" w:w="3743"/>
             <w:tcBorders>
               <w:top w:val="single" w:color="BFBFBF" w:sz="4"/>
               <w:left w:val="single" w:color="BFBFBF" w:sz="4"/>
@@ -4888,7 +4888,7 @@
         </w:trPr>
         <w:tc>
           <w:tcPr>
-            <w:tcW w:type="dxa" w:w="4216"/>
+            <w:tcW w:type="dxa" w:w="3275"/>
             <w:tcBorders>
               <w:top w:val="single" w:color="BFBFBF" w:sz="4"/>
               <w:left w:val="single" w:color="BFBFBF" w:sz="4"/>
@@ -4917,7 +4917,7 @@
         </w:tc>
         <w:tc>
           <w:tcPr>
-            <w:tcW w:type="dxa" w:w="3252"/>
+            <w:tcW w:type="dxa" w:w="2620"/>
             <w:tcBorders>
               <w:top w:val="single" w:color="BFBFBF" w:sz="4"/>
               <w:left w:val="single" w:color="BFBFBF" w:sz="4"/>
@@ -4983,7 +4983,7 @@
         </w:tc>
         <w:tc>
           <w:tcPr>
-            <w:tcW w:type="dxa" w:w="2170"/>
+            <w:tcW w:type="dxa" w:w="3743"/>
             <w:tcBorders>
               <w:top w:val="single" w:color="BFBFBF" w:sz="4"/>
               <w:left w:val="single" w:color="BFBFBF" w:sz="4"/>
@@ -5017,7 +5017,7 @@
         </w:trPr>
         <w:tc>
           <w:tcPr>
-            <w:tcW w:type="dxa" w:w="4216"/>
+            <w:tcW w:type="dxa" w:w="3275"/>
             <w:tcBorders>
               <w:top w:val="single" w:color="BFBFBF" w:sz="4"/>
               <w:left w:val="single" w:color="BFBFBF" w:sz="4"/>
@@ -5046,7 +5046,7 @@
         </w:tc>
         <w:tc>
           <w:tcPr>
-            <w:tcW w:type="dxa" w:w="3252"/>
+            <w:tcW w:type="dxa" w:w="2620"/>
             <w:tcBorders>
               <w:top w:val="single" w:color="BFBFBF" w:sz="4"/>
               <w:left w:val="single" w:color="BFBFBF" w:sz="4"/>
@@ -5112,7 +5112,7 @@
         </w:tc>
         <w:tc>
           <w:tcPr>
-            <w:tcW w:type="dxa" w:w="2170"/>
+            <w:tcW w:type="dxa" w:w="3743"/>
             <w:tcBorders>
               <w:top w:val="single" w:color="BFBFBF" w:sz="4"/>
               <w:left w:val="single" w:color="BFBFBF" w:sz="4"/>
@@ -5146,7 +5146,7 @@
         </w:trPr>
         <w:tc>
           <w:tcPr>
-            <w:tcW w:type="dxa" w:w="4216"/>
+            <w:tcW w:type="dxa" w:w="3275"/>
             <w:tcBorders>
               <w:top w:val="single" w:color="BFBFBF" w:sz="4"/>
               <w:left w:val="single" w:color="BFBFBF" w:sz="4"/>
@@ -5175,7 +5175,7 @@
         </w:tc>
         <w:tc>
           <w:tcPr>
-            <w:tcW w:type="dxa" w:w="3252"/>
+            <w:tcW w:type="dxa" w:w="2620"/>
             <w:tcBorders>
               <w:top w:val="single" w:color="BFBFBF" w:sz="4"/>
               <w:left w:val="single" w:color="BFBFBF" w:sz="4"/>
@@ -5241,7 +5241,7 @@
         </w:tc>
         <w:tc>
           <w:tcPr>
-            <w:tcW w:type="dxa" w:w="2170"/>
+            <w:tcW w:type="dxa" w:w="3743"/>
             <w:tcBorders>
               <w:top w:val="single" w:color="BFBFBF" w:sz="4"/>
               <w:left w:val="single" w:color="BFBFBF" w:sz="4"/>
@@ -5275,7 +5275,7 @@
         </w:trPr>
         <w:tc>
           <w:tcPr>
-            <w:tcW w:type="dxa" w:w="4216"/>
+            <w:tcW w:type="dxa" w:w="3275"/>
             <w:tcBorders>
               <w:top w:val="single" w:color="BFBFBF" w:sz="4"/>
               <w:left w:val="single" w:color="BFBFBF" w:sz="4"/>
@@ -5304,7 +5304,7 @@
         </w:tc>
         <w:tc>
           <w:tcPr>
-            <w:tcW w:type="dxa" w:w="3252"/>
+            <w:tcW w:type="dxa" w:w="2620"/>
             <w:tcBorders>
               <w:top w:val="single" w:color="BFBFBF" w:sz="4"/>
               <w:left w:val="single" w:color="BFBFBF" w:sz="4"/>
@@ -5370,7 +5370,7 @@
         </w:tc>
         <w:tc>
           <w:tcPr>
-            <w:tcW w:type="dxa" w:w="2170"/>
+            <w:tcW w:type="dxa" w:w="3743"/>
             <w:tcBorders>
               <w:top w:val="single" w:color="BFBFBF" w:sz="4"/>
               <w:left w:val="single" w:color="BFBFBF" w:sz="4"/>
@@ -5404,7 +5404,7 @@
         </w:trPr>
         <w:tc>
           <w:tcPr>
-            <w:tcW w:type="dxa" w:w="4216"/>
+            <w:tcW w:type="dxa" w:w="3275"/>
             <w:tcBorders>
               <w:top w:val="single" w:color="BFBFBF" w:sz="4"/>
               <w:left w:val="single" w:color="BFBFBF" w:sz="4"/>
@@ -5433,7 +5433,7 @@
         </w:tc>
         <w:tc>
           <w:tcPr>
-            <w:tcW w:type="dxa" w:w="3252"/>
+            <w:tcW w:type="dxa" w:w="2620"/>
             <w:tcBorders>
               <w:top w:val="single" w:color="BFBFBF" w:sz="4"/>
               <w:left w:val="single" w:color="BFBFBF" w:sz="4"/>
@@ -5482,7 +5482,7 @@
         </w:tc>
         <w:tc>
           <w:tcPr>
-            <w:tcW w:type="dxa" w:w="2170"/>
+            <w:tcW w:type="dxa" w:w="3743"/>
             <w:tcBorders>
               <w:top w:val="single" w:color="BFBFBF" w:sz="4"/>
               <w:left w:val="single" w:color="BFBFBF" w:sz="4"/>
@@ -5516,7 +5516,7 @@
         </w:trPr>
         <w:tc>
           <w:tcPr>
-            <w:tcW w:type="dxa" w:w="4216"/>
+            <w:tcW w:type="dxa" w:w="3275"/>
             <w:tcBorders>
               <w:top w:val="single" w:color="BFBFBF" w:sz="4"/>
               <w:left w:val="single" w:color="BFBFBF" w:sz="4"/>
@@ -5545,7 +5545,7 @@
         </w:tc>
         <w:tc>
           <w:tcPr>
-            <w:tcW w:type="dxa" w:w="3252"/>
+            <w:tcW w:type="dxa" w:w="2620"/>
             <w:tcBorders>
               <w:top w:val="single" w:color="BFBFBF" w:sz="4"/>
               <w:left w:val="single" w:color="BFBFBF" w:sz="4"/>
@@ -5577,30 +5577,30 @@
         </w:tc>
         <w:tc>
           <w:tcPr>
-            <w:tcW w:type="dxa" w:w="2170"/>
-            <w:tcBorders>
-              <w:top w:val="single" w:color="BFBFBF" w:sz="4"/>
-              <w:left w:val="single" w:color="BFBFBF" w:sz="4"/>
-              <w:bottom w:val="single" w:color="BFBFBF" w:sz="4"/>
-              <w:right w:val="single" w:color="BFBFBF" w:sz="4"/>
-            </w:tcBorders>
-            <w:tcMar>
-              <w:top w:type="dxa" w:w="60"/>
-              <w:left w:type="dxa" w:w="100"/>
-              <w:bottom w:type="dxa" w:w="60"/>
-              <w:right w:type="dxa" w:w="100"/>
-            </w:tcMar>
-          </w:tcPr>
-          <w:p>
-            <w:pPr>
-              <w:spacing w:after="0" w:before="0"/>
-            </w:pPr>
-            <w:r>
-              <w:rPr>
-                <w:sz w:val="18"/>
-                <w:szCs w:val="18"/>
-              </w:rPr>
-              <w:t xml:space="preserve">TextBlock</w:t>
+            <w:tcW w:type="dxa" w:w="3743"/>
+            <w:tcBorders>
+              <w:top w:val="single" w:color="BFBFBF" w:sz="4"/>
+              <w:left w:val="single" w:color="BFBFBF" w:sz="4"/>
+              <w:bottom w:val="single" w:color="BFBFBF" w:sz="4"/>
+              <w:right w:val="single" w:color="BFBFBF" w:sz="4"/>
+            </w:tcBorders>
+            <w:tcMar>
+              <w:top w:type="dxa" w:w="60"/>
+              <w:left w:type="dxa" w:w="100"/>
+              <w:bottom w:type="dxa" w:w="60"/>
+              <w:right w:type="dxa" w:w="100"/>
+            </w:tcMar>
+          </w:tcPr>
+          <w:p>
+            <w:pPr>
+              <w:spacing w:after="0" w:before="0"/>
+            </w:pPr>
+            <w:r>
+              <w:rPr>
+                <w:sz w:val="18"/>
+                <w:szCs w:val="18"/>
+              </w:rPr>
+              <w:t xml:space="preserve">TextBlock (앞에 "범위 :" 라벨 추가)</w:t>
             </w:r>
           </w:p>
         </w:tc>
@@ -5611,88 +5611,108 @@
         </w:trPr>
         <w:tc>
           <w:tcPr>
-            <w:tcW w:type="dxa" w:w="4216"/>
-            <w:tcBorders>
-              <w:top w:val="single" w:color="BFBFBF" w:sz="4"/>
-              <w:left w:val="single" w:color="BFBFBF" w:sz="4"/>
-              <w:bottom w:val="single" w:color="BFBFBF" w:sz="4"/>
-              <w:right w:val="single" w:color="BFBFBF" w:sz="4"/>
-            </w:tcBorders>
-            <w:tcMar>
-              <w:top w:type="dxa" w:w="60"/>
-              <w:left w:type="dxa" w:w="100"/>
-              <w:bottom w:type="dxa" w:w="60"/>
-              <w:right w:type="dxa" w:w="100"/>
-            </w:tcMar>
-          </w:tcPr>
-          <w:p>
-            <w:pPr>
-              <w:spacing w:after="0" w:before="0"/>
-            </w:pPr>
-            <w:r>
-              <w:rPr>
-                <w:sz w:val="18"/>
-                <w:szCs w:val="18"/>
-              </w:rPr>
-              <w:t xml:space="preserve">RbColor, RbR, RbG, RbB</w:t>
-            </w:r>
-          </w:p>
-        </w:tc>
-        <w:tc>
-          <w:tcPr>
-            <w:tcW w:type="dxa" w:w="3252"/>
-            <w:tcBorders>
-              <w:top w:val="single" w:color="BFBFBF" w:sz="4"/>
-              <w:left w:val="single" w:color="BFBFBF" w:sz="4"/>
-              <w:bottom w:val="single" w:color="BFBFBF" w:sz="4"/>
-              <w:right w:val="single" w:color="BFBFBF" w:sz="4"/>
-            </w:tcBorders>
-            <w:tcMar>
-              <w:top w:type="dxa" w:w="60"/>
-              <w:left w:type="dxa" w:w="100"/>
-              <w:bottom w:type="dxa" w:w="60"/>
-              <w:right w:type="dxa" w:w="100"/>
-            </w:tcMar>
-          </w:tcPr>
-          <w:p>
-            <w:pPr>
-              <w:spacing w:after="0" w:before="0"/>
-            </w:pPr>
-            <w:r>
-              <w:rPr>
-                <w:sz w:val="18"/>
-                <w:szCs w:val="18"/>
-              </w:rPr>
-              <w:t xml:space="preserve">(그대로)</w:t>
-            </w:r>
-          </w:p>
-        </w:tc>
-        <w:tc>
-          <w:tcPr>
-            <w:tcW w:type="dxa" w:w="2170"/>
-            <w:tcBorders>
-              <w:top w:val="single" w:color="BFBFBF" w:sz="4"/>
-              <w:left w:val="single" w:color="BFBFBF" w:sz="4"/>
-              <w:bottom w:val="single" w:color="BFBFBF" w:sz="4"/>
-              <w:right w:val="single" w:color="BFBFBF" w:sz="4"/>
-            </w:tcBorders>
-            <w:tcMar>
-              <w:top w:type="dxa" w:w="60"/>
-              <w:left w:type="dxa" w:w="100"/>
-              <w:bottom w:type="dxa" w:w="60"/>
-              <w:right w:type="dxa" w:w="100"/>
-            </w:tcMar>
-          </w:tcPr>
-          <w:p>
-            <w:pPr>
-              <w:spacing w:after="0" w:before="0"/>
-            </w:pPr>
-            <w:r>
-              <w:rPr>
-                <w:sz w:val="18"/>
-                <w:szCs w:val="18"/>
-              </w:rPr>
-              <w:t xml:space="preserve">RadioButton</w:t>
+            <w:tcW w:type="dxa" w:w="3275"/>
+            <w:tcBorders>
+              <w:top w:val="single" w:color="BFBFBF" w:sz="4"/>
+              <w:left w:val="single" w:color="BFBFBF" w:sz="4"/>
+              <w:bottom w:val="single" w:color="BFBFBF" w:sz="4"/>
+              <w:right w:val="single" w:color="BFBFBF" w:sz="4"/>
+            </w:tcBorders>
+            <w:tcMar>
+              <w:top w:type="dxa" w:w="60"/>
+              <w:left w:type="dxa" w:w="100"/>
+              <w:bottom w:type="dxa" w:w="60"/>
+              <w:right w:type="dxa" w:w="100"/>
+            </w:tcMar>
+          </w:tcPr>
+          <w:p>
+            <w:pPr>
+              <w:spacing w:after="0" w:before="0"/>
+            </w:pPr>
+            <w:r>
+              <w:rPr>
+                <w:sz w:val="18"/>
+                <w:szCs w:val="18"/>
+              </w:rPr>
+              <w:t xml:space="preserve">(신규)</w:t>
+            </w:r>
+          </w:p>
+        </w:tc>
+        <w:tc>
+          <w:tcPr>
+            <w:tcW w:type="dxa" w:w="2620"/>
+            <w:tcBorders>
+              <w:top w:val="single" w:color="BFBFBF" w:sz="4"/>
+              <w:left w:val="single" w:color="BFBFBF" w:sz="4"/>
+              <w:bottom w:val="single" w:color="BFBFBF" w:sz="4"/>
+              <w:right w:val="single" w:color="BFBFBF" w:sz="4"/>
+            </w:tcBorders>
+            <w:tcMar>
+              <w:top w:type="dxa" w:w="60"/>
+              <w:left w:type="dxa" w:w="100"/>
+              <w:bottom w:type="dxa" w:w="60"/>
+              <w:right w:type="dxa" w:w="100"/>
+            </w:tcMar>
+          </w:tcPr>
+          <w:p>
+            <w:pPr>
+              <w:spacing w:after="0" w:before="0"/>
+            </w:pPr>
+            <w:r>
+              <w:rPr>
+                <w:rFonts w:ascii="Consolas" w:eastAsia="맑은 고딕" w:hAnsi="Consolas"/>
+                <w:color w:val="A31515"/>
+                <w:sz w:val="18"/>
+                <w:szCs w:val="18"/>
+                <w:shd w:fill="F2F2F2" w:color="auto" w:val="clear"/>
+              </w:rPr>
+              <w:t xml:space="preserve">ResultCanvas</w:t>
+            </w:r>
+            <w:r>
+              <w:rPr>
+                <w:sz w:val="18"/>
+                <w:szCs w:val="18"/>
+              </w:rPr>
+              <w:t xml:space="preserve"> / </w:t>
+            </w:r>
+            <w:r>
+              <w:rPr>
+                <w:rFonts w:ascii="Consolas" w:eastAsia="맑은 고딕" w:hAnsi="Consolas"/>
+                <w:color w:val="A31515"/>
+                <w:sz w:val="18"/>
+                <w:szCs w:val="18"/>
+                <w:shd w:fill="F2F2F2" w:color="auto" w:val="clear"/>
+              </w:rPr>
+              <w:t xml:space="preserve">ResultRoiRect</w:t>
+            </w:r>
+          </w:p>
+        </w:tc>
+        <w:tc>
+          <w:tcPr>
+            <w:tcW w:type="dxa" w:w="3743"/>
+            <w:tcBorders>
+              <w:top w:val="single" w:color="BFBFBF" w:sz="4"/>
+              <w:left w:val="single" w:color="BFBFBF" w:sz="4"/>
+              <w:bottom w:val="single" w:color="BFBFBF" w:sz="4"/>
+              <w:right w:val="single" w:color="BFBFBF" w:sz="4"/>
+            </w:tcBorders>
+            <w:tcMar>
+              <w:top w:type="dxa" w:w="60"/>
+              <w:left w:type="dxa" w:w="100"/>
+              <w:bottom w:type="dxa" w:w="60"/>
+              <w:right w:type="dxa" w:w="100"/>
+            </w:tcMar>
+          </w:tcPr>
+          <w:p>
+            <w:pPr>
+              <w:spacing w:after="0" w:before="0"/>
+            </w:pPr>
+            <w:r>
+              <w:rPr>
+                <w:sz w:val="18"/>
+                <w:szCs w:val="18"/>
+              </w:rPr>
+              <w:t xml:space="preserve">Viewer2 위에 겹친 ROI 표시용 Canvas / Rectangle</w:t>
             </w:r>
           </w:p>
         </w:tc>
@@ -5703,91 +5723,88 @@
         </w:trPr>
         <w:tc>
           <w:tcPr>
-            <w:tcW w:type="dxa" w:w="4216"/>
-            <w:tcBorders>
-              <w:top w:val="single" w:color="BFBFBF" w:sz="4"/>
-              <w:left w:val="single" w:color="BFBFBF" w:sz="4"/>
-              <w:bottom w:val="single" w:color="BFBFBF" w:sz="4"/>
-              <w:right w:val="single" w:color="BFBFBF" w:sz="4"/>
-            </w:tcBorders>
-            <w:tcMar>
-              <w:top w:type="dxa" w:w="60"/>
-              <w:left w:type="dxa" w:w="100"/>
-              <w:bottom w:type="dxa" w:w="60"/>
-              <w:right w:type="dxa" w:w="100"/>
-            </w:tcMar>
-          </w:tcPr>
-          <w:p>
-            <w:pPr>
-              <w:spacing w:after="0" w:before="0"/>
-            </w:pPr>
-            <w:r>
-              <w:rPr>
-                <w:sz w:val="18"/>
-                <w:szCs w:val="18"/>
-              </w:rPr>
-              <w:t xml:space="preserve">TxtProcessingTime</w:t>
-            </w:r>
-          </w:p>
-        </w:tc>
-        <w:tc>
-          <w:tcPr>
-            <w:tcW w:type="dxa" w:w="3252"/>
-            <w:tcBorders>
-              <w:top w:val="single" w:color="BFBFBF" w:sz="4"/>
-              <w:left w:val="single" w:color="BFBFBF" w:sz="4"/>
-              <w:bottom w:val="single" w:color="BFBFBF" w:sz="4"/>
-              <w:right w:val="single" w:color="BFBFBF" w:sz="4"/>
-            </w:tcBorders>
-            <w:tcMar>
-              <w:top w:type="dxa" w:w="60"/>
-              <w:left w:type="dxa" w:w="100"/>
-              <w:bottom w:type="dxa" w:w="60"/>
-              <w:right w:type="dxa" w:w="100"/>
-            </w:tcMar>
-          </w:tcPr>
-          <w:p>
-            <w:pPr>
-              <w:spacing w:after="0" w:before="0"/>
-            </w:pPr>
-            <w:r>
-              <w:rPr>
-                <w:rFonts w:ascii="Consolas" w:eastAsia="맑은 고딕" w:hAnsi="Consolas"/>
-                <w:color w:val="A31515"/>
-                <w:sz w:val="18"/>
-                <w:szCs w:val="18"/>
-                <w:shd w:fill="F2F2F2" w:color="auto" w:val="clear"/>
-              </w:rPr>
-              <w:t xml:space="preserve">TxtTime</w:t>
-            </w:r>
-          </w:p>
-        </w:tc>
-        <w:tc>
-          <w:tcPr>
-            <w:tcW w:type="dxa" w:w="2170"/>
-            <w:tcBorders>
-              <w:top w:val="single" w:color="BFBFBF" w:sz="4"/>
-              <w:left w:val="single" w:color="BFBFBF" w:sz="4"/>
-              <w:bottom w:val="single" w:color="BFBFBF" w:sz="4"/>
-              <w:right w:val="single" w:color="BFBFBF" w:sz="4"/>
-            </w:tcBorders>
-            <w:tcMar>
-              <w:top w:type="dxa" w:w="60"/>
-              <w:left w:type="dxa" w:w="100"/>
-              <w:bottom w:type="dxa" w:w="60"/>
-              <w:right w:type="dxa" w:w="100"/>
-            </w:tcMar>
-          </w:tcPr>
-          <w:p>
-            <w:pPr>
-              <w:spacing w:after="0" w:before="0"/>
-            </w:pPr>
-            <w:r>
-              <w:rPr>
-                <w:sz w:val="18"/>
-                <w:szCs w:val="18"/>
-              </w:rPr>
-              <w:t xml:space="preserve">TextBlock</w:t>
+            <w:tcW w:type="dxa" w:w="3275"/>
+            <w:tcBorders>
+              <w:top w:val="single" w:color="BFBFBF" w:sz="4"/>
+              <w:left w:val="single" w:color="BFBFBF" w:sz="4"/>
+              <w:bottom w:val="single" w:color="BFBFBF" w:sz="4"/>
+              <w:right w:val="single" w:color="BFBFBF" w:sz="4"/>
+            </w:tcBorders>
+            <w:tcMar>
+              <w:top w:type="dxa" w:w="60"/>
+              <w:left w:type="dxa" w:w="100"/>
+              <w:bottom w:type="dxa" w:w="60"/>
+              <w:right w:type="dxa" w:w="100"/>
+            </w:tcMar>
+          </w:tcPr>
+          <w:p>
+            <w:pPr>
+              <w:spacing w:after="0" w:before="0"/>
+            </w:pPr>
+            <w:r>
+              <w:rPr>
+                <w:sz w:val="18"/>
+                <w:szCs w:val="18"/>
+              </w:rPr>
+              <w:t xml:space="preserve">RbColor, RbR, RbG, RbB</w:t>
+            </w:r>
+          </w:p>
+        </w:tc>
+        <w:tc>
+          <w:tcPr>
+            <w:tcW w:type="dxa" w:w="2620"/>
+            <w:tcBorders>
+              <w:top w:val="single" w:color="BFBFBF" w:sz="4"/>
+              <w:left w:val="single" w:color="BFBFBF" w:sz="4"/>
+              <w:bottom w:val="single" w:color="BFBFBF" w:sz="4"/>
+              <w:right w:val="single" w:color="BFBFBF" w:sz="4"/>
+            </w:tcBorders>
+            <w:tcMar>
+              <w:top w:type="dxa" w:w="60"/>
+              <w:left w:type="dxa" w:w="100"/>
+              <w:bottom w:type="dxa" w:w="60"/>
+              <w:right w:type="dxa" w:w="100"/>
+            </w:tcMar>
+          </w:tcPr>
+          <w:p>
+            <w:pPr>
+              <w:spacing w:after="0" w:before="0"/>
+            </w:pPr>
+            <w:r>
+              <w:rPr>
+                <w:sz w:val="18"/>
+                <w:szCs w:val="18"/>
+              </w:rPr>
+              <w:t xml:space="preserve">(그대로)</w:t>
+            </w:r>
+          </w:p>
+        </w:tc>
+        <w:tc>
+          <w:tcPr>
+            <w:tcW w:type="dxa" w:w="3743"/>
+            <w:tcBorders>
+              <w:top w:val="single" w:color="BFBFBF" w:sz="4"/>
+              <w:left w:val="single" w:color="BFBFBF" w:sz="4"/>
+              <w:bottom w:val="single" w:color="BFBFBF" w:sz="4"/>
+              <w:right w:val="single" w:color="BFBFBF" w:sz="4"/>
+            </w:tcBorders>
+            <w:tcMar>
+              <w:top w:type="dxa" w:w="60"/>
+              <w:left w:type="dxa" w:w="100"/>
+              <w:bottom w:type="dxa" w:w="60"/>
+              <w:right w:type="dxa" w:w="100"/>
+            </w:tcMar>
+          </w:tcPr>
+          <w:p>
+            <w:pPr>
+              <w:spacing w:after="0" w:before="0"/>
+            </w:pPr>
+            <w:r>
+              <w:rPr>
+                <w:sz w:val="18"/>
+                <w:szCs w:val="18"/>
+              </w:rPr>
+              <w:t xml:space="preserve">RadioButton</w:t>
             </w:r>
           </w:p>
         </w:tc>
@@ -5798,36 +5815,36 @@
         </w:trPr>
         <w:tc>
           <w:tcPr>
-            <w:tcW w:type="dxa" w:w="4216"/>
-            <w:tcBorders>
-              <w:top w:val="single" w:color="BFBFBF" w:sz="4"/>
-              <w:left w:val="single" w:color="BFBFBF" w:sz="4"/>
-              <w:bottom w:val="single" w:color="BFBFBF" w:sz="4"/>
-              <w:right w:val="single" w:color="BFBFBF" w:sz="4"/>
-            </w:tcBorders>
-            <w:tcMar>
-              <w:top w:type="dxa" w:w="60"/>
-              <w:left w:type="dxa" w:w="100"/>
-              <w:bottom w:type="dxa" w:w="60"/>
-              <w:right w:type="dxa" w:w="100"/>
-            </w:tcMar>
-          </w:tcPr>
-          <w:p>
-            <w:pPr>
-              <w:spacing w:after="0" w:before="0"/>
-            </w:pPr>
-            <w:r>
-              <w:rPr>
-                <w:sz w:val="18"/>
-                <w:szCs w:val="18"/>
-              </w:rPr>
-              <w:t xml:space="preserve">TemplatePreview</w:t>
-            </w:r>
-          </w:p>
-        </w:tc>
-        <w:tc>
-          <w:tcPr>
-            <w:tcW w:type="dxa" w:w="3252"/>
+            <w:tcW w:type="dxa" w:w="3275"/>
+            <w:tcBorders>
+              <w:top w:val="single" w:color="BFBFBF" w:sz="4"/>
+              <w:left w:val="single" w:color="BFBFBF" w:sz="4"/>
+              <w:bottom w:val="single" w:color="BFBFBF" w:sz="4"/>
+              <w:right w:val="single" w:color="BFBFBF" w:sz="4"/>
+            </w:tcBorders>
+            <w:tcMar>
+              <w:top w:type="dxa" w:w="60"/>
+              <w:left w:type="dxa" w:w="100"/>
+              <w:bottom w:type="dxa" w:w="60"/>
+              <w:right w:type="dxa" w:w="100"/>
+            </w:tcMar>
+          </w:tcPr>
+          <w:p>
+            <w:pPr>
+              <w:spacing w:after="0" w:before="0"/>
+            </w:pPr>
+            <w:r>
+              <w:rPr>
+                <w:sz w:val="18"/>
+                <w:szCs w:val="18"/>
+              </w:rPr>
+              <w:t xml:space="preserve">TxtProcessingTime</w:t>
+            </w:r>
+          </w:p>
+        </w:tc>
+        <w:tc>
+          <w:tcPr>
+            <w:tcW w:type="dxa" w:w="2620"/>
             <w:tcBorders>
               <w:top w:val="single" w:color="BFBFBF" w:sz="4"/>
               <w:left w:val="single" w:color="BFBFBF" w:sz="4"/>
@@ -5853,36 +5870,36 @@
                 <w:szCs w:val="18"/>
                 <w:shd w:fill="F2F2F2" w:color="auto" w:val="clear"/>
               </w:rPr>
-              <w:t xml:space="preserve">TemplateView</w:t>
-            </w:r>
-          </w:p>
-        </w:tc>
-        <w:tc>
-          <w:tcPr>
-            <w:tcW w:type="dxa" w:w="2170"/>
-            <w:tcBorders>
-              <w:top w:val="single" w:color="BFBFBF" w:sz="4"/>
-              <w:left w:val="single" w:color="BFBFBF" w:sz="4"/>
-              <w:bottom w:val="single" w:color="BFBFBF" w:sz="4"/>
-              <w:right w:val="single" w:color="BFBFBF" w:sz="4"/>
-            </w:tcBorders>
-            <w:tcMar>
-              <w:top w:type="dxa" w:w="60"/>
-              <w:left w:type="dxa" w:w="100"/>
-              <w:bottom w:type="dxa" w:w="60"/>
-              <w:right w:type="dxa" w:w="100"/>
-            </w:tcMar>
-          </w:tcPr>
-          <w:p>
-            <w:pPr>
-              <w:spacing w:after="0" w:before="0"/>
-            </w:pPr>
-            <w:r>
-              <w:rPr>
-                <w:sz w:val="18"/>
-                <w:szCs w:val="18"/>
-              </w:rPr>
-              <w:t xml:space="preserve">Image</w:t>
+              <w:t xml:space="preserve">TxtTime</w:t>
+            </w:r>
+          </w:p>
+        </w:tc>
+        <w:tc>
+          <w:tcPr>
+            <w:tcW w:type="dxa" w:w="3743"/>
+            <w:tcBorders>
+              <w:top w:val="single" w:color="BFBFBF" w:sz="4"/>
+              <w:left w:val="single" w:color="BFBFBF" w:sz="4"/>
+              <w:bottom w:val="single" w:color="BFBFBF" w:sz="4"/>
+              <w:right w:val="single" w:color="BFBFBF" w:sz="4"/>
+            </w:tcBorders>
+            <w:tcMar>
+              <w:top w:type="dxa" w:w="60"/>
+              <w:left w:type="dxa" w:w="100"/>
+              <w:bottom w:type="dxa" w:w="60"/>
+              <w:right w:type="dxa" w:w="100"/>
+            </w:tcMar>
+          </w:tcPr>
+          <w:p>
+            <w:pPr>
+              <w:spacing w:after="0" w:before="0"/>
+            </w:pPr>
+            <w:r>
+              <w:rPr>
+                <w:sz w:val="18"/>
+                <w:szCs w:val="18"/>
+              </w:rPr>
+              <w:t xml:space="preserve">TextBlock</w:t>
             </w:r>
           </w:p>
         </w:tc>
@@ -5893,36 +5910,36 @@
         </w:trPr>
         <w:tc>
           <w:tcPr>
-            <w:tcW w:type="dxa" w:w="4216"/>
-            <w:tcBorders>
-              <w:top w:val="single" w:color="BFBFBF" w:sz="4"/>
-              <w:left w:val="single" w:color="BFBFBF" w:sz="4"/>
-              <w:bottom w:val="single" w:color="BFBFBF" w:sz="4"/>
-              <w:right w:val="single" w:color="BFBFBF" w:sz="4"/>
-            </w:tcBorders>
-            <w:tcMar>
-              <w:top w:type="dxa" w:w="60"/>
-              <w:left w:type="dxa" w:w="100"/>
-              <w:bottom w:type="dxa" w:w="60"/>
-              <w:right w:type="dxa" w:w="100"/>
-            </w:tcMar>
-          </w:tcPr>
-          <w:p>
-            <w:pPr>
-              <w:spacing w:after="0" w:before="0"/>
-            </w:pPr>
-            <w:r>
-              <w:rPr>
-                <w:sz w:val="18"/>
-                <w:szCs w:val="18"/>
-              </w:rPr>
-              <w:t xml:space="preserve">SliderThreshold / TxtThresholdValue</w:t>
-            </w:r>
-          </w:p>
-        </w:tc>
-        <w:tc>
-          <w:tcPr>
-            <w:tcW w:type="dxa" w:w="3252"/>
+            <w:tcW w:type="dxa" w:w="3275"/>
+            <w:tcBorders>
+              <w:top w:val="single" w:color="BFBFBF" w:sz="4"/>
+              <w:left w:val="single" w:color="BFBFBF" w:sz="4"/>
+              <w:bottom w:val="single" w:color="BFBFBF" w:sz="4"/>
+              <w:right w:val="single" w:color="BFBFBF" w:sz="4"/>
+            </w:tcBorders>
+            <w:tcMar>
+              <w:top w:type="dxa" w:w="60"/>
+              <w:left w:type="dxa" w:w="100"/>
+              <w:bottom w:type="dxa" w:w="60"/>
+              <w:right w:type="dxa" w:w="100"/>
+            </w:tcMar>
+          </w:tcPr>
+          <w:p>
+            <w:pPr>
+              <w:spacing w:after="0" w:before="0"/>
+            </w:pPr>
+            <w:r>
+              <w:rPr>
+                <w:sz w:val="18"/>
+                <w:szCs w:val="18"/>
+              </w:rPr>
+              <w:t xml:space="preserve">TemplatePreview</w:t>
+            </w:r>
+          </w:p>
+        </w:tc>
+        <w:tc>
+          <w:tcPr>
+            <w:tcW w:type="dxa" w:w="2620"/>
             <w:tcBorders>
               <w:top w:val="single" w:color="BFBFBF" w:sz="4"/>
               <w:left w:val="single" w:color="BFBFBF" w:sz="4"/>
@@ -5948,53 +5965,36 @@
                 <w:szCs w:val="18"/>
                 <w:shd w:fill="F2F2F2" w:color="auto" w:val="clear"/>
               </w:rPr>
-              <w:t xml:space="preserve">SldThreshold</w:t>
-            </w:r>
-            <w:r>
-              <w:rPr>
-                <w:sz w:val="18"/>
-                <w:szCs w:val="18"/>
-              </w:rPr>
-              <w:t xml:space="preserve"> / </w:t>
-            </w:r>
-            <w:r>
-              <w:rPr>
-                <w:rFonts w:ascii="Consolas" w:eastAsia="맑은 고딕" w:hAnsi="Consolas"/>
-                <w:color w:val="A31515"/>
-                <w:sz w:val="18"/>
-                <w:szCs w:val="18"/>
-                <w:shd w:fill="F2F2F2" w:color="auto" w:val="clear"/>
-              </w:rPr>
-              <w:t xml:space="preserve">TxtThreshold</w:t>
-            </w:r>
-          </w:p>
-        </w:tc>
-        <w:tc>
-          <w:tcPr>
-            <w:tcW w:type="dxa" w:w="2170"/>
-            <w:tcBorders>
-              <w:top w:val="single" w:color="BFBFBF" w:sz="4"/>
-              <w:left w:val="single" w:color="BFBFBF" w:sz="4"/>
-              <w:bottom w:val="single" w:color="BFBFBF" w:sz="4"/>
-              <w:right w:val="single" w:color="BFBFBF" w:sz="4"/>
-            </w:tcBorders>
-            <w:tcMar>
-              <w:top w:type="dxa" w:w="60"/>
-              <w:left w:type="dxa" w:w="100"/>
-              <w:bottom w:type="dxa" w:w="60"/>
-              <w:right w:type="dxa" w:w="100"/>
-            </w:tcMar>
-          </w:tcPr>
-          <w:p>
-            <w:pPr>
-              <w:spacing w:after="0" w:before="0"/>
-            </w:pPr>
-            <w:r>
-              <w:rPr>
-                <w:sz w:val="18"/>
-                <w:szCs w:val="18"/>
-              </w:rPr>
-              <w:t xml:space="preserve">Slider / TextBlock</w:t>
+              <w:t xml:space="preserve">TemplateView</w:t>
+            </w:r>
+          </w:p>
+        </w:tc>
+        <w:tc>
+          <w:tcPr>
+            <w:tcW w:type="dxa" w:w="3743"/>
+            <w:tcBorders>
+              <w:top w:val="single" w:color="BFBFBF" w:sz="4"/>
+              <w:left w:val="single" w:color="BFBFBF" w:sz="4"/>
+              <w:bottom w:val="single" w:color="BFBFBF" w:sz="4"/>
+              <w:right w:val="single" w:color="BFBFBF" w:sz="4"/>
+            </w:tcBorders>
+            <w:tcMar>
+              <w:top w:type="dxa" w:w="60"/>
+              <w:left w:type="dxa" w:w="100"/>
+              <w:bottom w:type="dxa" w:w="60"/>
+              <w:right w:type="dxa" w:w="100"/>
+            </w:tcMar>
+          </w:tcPr>
+          <w:p>
+            <w:pPr>
+              <w:spacing w:after="0" w:before="0"/>
+            </w:pPr>
+            <w:r>
+              <w:rPr>
+                <w:sz w:val="18"/>
+                <w:szCs w:val="18"/>
+              </w:rPr>
+              <w:t xml:space="preserve">Image</w:t>
             </w:r>
           </w:p>
         </w:tc>
@@ -6005,36 +6005,36 @@
         </w:trPr>
         <w:tc>
           <w:tcPr>
-            <w:tcW w:type="dxa" w:w="4216"/>
-            <w:tcBorders>
-              <w:top w:val="single" w:color="BFBFBF" w:sz="4"/>
-              <w:left w:val="single" w:color="BFBFBF" w:sz="4"/>
-              <w:bottom w:val="single" w:color="BFBFBF" w:sz="4"/>
-              <w:right w:val="single" w:color="BFBFBF" w:sz="4"/>
-            </w:tcBorders>
-            <w:tcMar>
-              <w:top w:type="dxa" w:w="60"/>
-              <w:left w:type="dxa" w:w="100"/>
-              <w:bottom w:type="dxa" w:w="60"/>
-              <w:right w:type="dxa" w:w="100"/>
-            </w:tcMar>
-          </w:tcPr>
-          <w:p>
-            <w:pPr>
-              <w:spacing w:after="0" w:before="0"/>
-            </w:pPr>
-            <w:r>
-              <w:rPr>
-                <w:sz w:val="18"/>
-                <w:szCs w:val="18"/>
-              </w:rPr>
-              <w:t xml:space="preserve">SliderSigma / TxtSigmaValue</w:t>
-            </w:r>
-          </w:p>
-        </w:tc>
-        <w:tc>
-          <w:tcPr>
-            <w:tcW w:type="dxa" w:w="3252"/>
+            <w:tcW w:type="dxa" w:w="3275"/>
+            <w:tcBorders>
+              <w:top w:val="single" w:color="BFBFBF" w:sz="4"/>
+              <w:left w:val="single" w:color="BFBFBF" w:sz="4"/>
+              <w:bottom w:val="single" w:color="BFBFBF" w:sz="4"/>
+              <w:right w:val="single" w:color="BFBFBF" w:sz="4"/>
+            </w:tcBorders>
+            <w:tcMar>
+              <w:top w:type="dxa" w:w="60"/>
+              <w:left w:type="dxa" w:w="100"/>
+              <w:bottom w:type="dxa" w:w="60"/>
+              <w:right w:type="dxa" w:w="100"/>
+            </w:tcMar>
+          </w:tcPr>
+          <w:p>
+            <w:pPr>
+              <w:spacing w:after="0" w:before="0"/>
+            </w:pPr>
+            <w:r>
+              <w:rPr>
+                <w:sz w:val="18"/>
+                <w:szCs w:val="18"/>
+              </w:rPr>
+              <w:t xml:space="preserve">SliderThreshold / TxtThresholdValue</w:t>
+            </w:r>
+          </w:p>
+        </w:tc>
+        <w:tc>
+          <w:tcPr>
+            <w:tcW w:type="dxa" w:w="2620"/>
             <w:tcBorders>
               <w:top w:val="single" w:color="BFBFBF" w:sz="4"/>
               <w:left w:val="single" w:color="BFBFBF" w:sz="4"/>
@@ -6060,7 +6060,7 @@
                 <w:szCs w:val="18"/>
                 <w:shd w:fill="F2F2F2" w:color="auto" w:val="clear"/>
               </w:rPr>
-              <w:t xml:space="preserve">SldSigma</w:t>
+              <w:t xml:space="preserve">SldThreshold</w:t>
             </w:r>
             <w:r>
               <w:rPr>
@@ -6077,13 +6077,13 @@
                 <w:szCs w:val="18"/>
                 <w:shd w:fill="F2F2F2" w:color="auto" w:val="clear"/>
               </w:rPr>
-              <w:t xml:space="preserve">TxtSigma</w:t>
-            </w:r>
-          </w:p>
-        </w:tc>
-        <w:tc>
-          <w:tcPr>
-            <w:tcW w:type="dxa" w:w="2170"/>
+              <w:t xml:space="preserve">TxtThreshold</w:t>
+            </w:r>
+          </w:p>
+        </w:tc>
+        <w:tc>
+          <w:tcPr>
+            <w:tcW w:type="dxa" w:w="3743"/>
             <w:tcBorders>
               <w:top w:val="single" w:color="BFBFBF" w:sz="4"/>
               <w:left w:val="single" w:color="BFBFBF" w:sz="4"/>
@@ -6117,36 +6117,36 @@
         </w:trPr>
         <w:tc>
           <w:tcPr>
-            <w:tcW w:type="dxa" w:w="4216"/>
-            <w:tcBorders>
-              <w:top w:val="single" w:color="BFBFBF" w:sz="4"/>
-              <w:left w:val="single" w:color="BFBFBF" w:sz="4"/>
-              <w:bottom w:val="single" w:color="BFBFBF" w:sz="4"/>
-              <w:right w:val="single" w:color="BFBFBF" w:sz="4"/>
-            </w:tcBorders>
-            <w:tcMar>
-              <w:top w:type="dxa" w:w="60"/>
-              <w:left w:type="dxa" w:w="100"/>
-              <w:bottom w:type="dxa" w:w="60"/>
-              <w:right w:type="dxa" w:w="100"/>
-            </w:tcMar>
-          </w:tcPr>
-          <w:p>
-            <w:pPr>
-              <w:spacing w:after="0" w:before="0"/>
-            </w:pPr>
-            <w:r>
-              <w:rPr>
-                <w:sz w:val="18"/>
-                <w:szCs w:val="18"/>
-              </w:rPr>
-              <w:t xml:space="preserve">CmbKernelSize</w:t>
-            </w:r>
-          </w:p>
-        </w:tc>
-        <w:tc>
-          <w:tcPr>
-            <w:tcW w:type="dxa" w:w="3252"/>
+            <w:tcW w:type="dxa" w:w="3275"/>
+            <w:tcBorders>
+              <w:top w:val="single" w:color="BFBFBF" w:sz="4"/>
+              <w:left w:val="single" w:color="BFBFBF" w:sz="4"/>
+              <w:bottom w:val="single" w:color="BFBFBF" w:sz="4"/>
+              <w:right w:val="single" w:color="BFBFBF" w:sz="4"/>
+            </w:tcBorders>
+            <w:tcMar>
+              <w:top w:type="dxa" w:w="60"/>
+              <w:left w:type="dxa" w:w="100"/>
+              <w:bottom w:type="dxa" w:w="60"/>
+              <w:right w:type="dxa" w:w="100"/>
+            </w:tcMar>
+          </w:tcPr>
+          <w:p>
+            <w:pPr>
+              <w:spacing w:after="0" w:before="0"/>
+            </w:pPr>
+            <w:r>
+              <w:rPr>
+                <w:sz w:val="18"/>
+                <w:szCs w:val="18"/>
+              </w:rPr>
+              <w:t xml:space="preserve">SliderSigma / TxtSigmaValue</w:t>
+            </w:r>
+          </w:p>
+        </w:tc>
+        <w:tc>
+          <w:tcPr>
+            <w:tcW w:type="dxa" w:w="2620"/>
             <w:tcBorders>
               <w:top w:val="single" w:color="BFBFBF" w:sz="4"/>
               <w:left w:val="single" w:color="BFBFBF" w:sz="4"/>
@@ -6172,13 +6172,125 @@
                 <w:szCs w:val="18"/>
                 <w:shd w:fill="F2F2F2" w:color="auto" w:val="clear"/>
               </w:rPr>
+              <w:t xml:space="preserve">SldSigma</w:t>
+            </w:r>
+            <w:r>
+              <w:rPr>
+                <w:sz w:val="18"/>
+                <w:szCs w:val="18"/>
+              </w:rPr>
+              <w:t xml:space="preserve"> / </w:t>
+            </w:r>
+            <w:r>
+              <w:rPr>
+                <w:rFonts w:ascii="Consolas" w:eastAsia="맑은 고딕" w:hAnsi="Consolas"/>
+                <w:color w:val="A31515"/>
+                <w:sz w:val="18"/>
+                <w:szCs w:val="18"/>
+                <w:shd w:fill="F2F2F2" w:color="auto" w:val="clear"/>
+              </w:rPr>
+              <w:t xml:space="preserve">TxtSigma</w:t>
+            </w:r>
+          </w:p>
+        </w:tc>
+        <w:tc>
+          <w:tcPr>
+            <w:tcW w:type="dxa" w:w="3743"/>
+            <w:tcBorders>
+              <w:top w:val="single" w:color="BFBFBF" w:sz="4"/>
+              <w:left w:val="single" w:color="BFBFBF" w:sz="4"/>
+              <w:bottom w:val="single" w:color="BFBFBF" w:sz="4"/>
+              <w:right w:val="single" w:color="BFBFBF" w:sz="4"/>
+            </w:tcBorders>
+            <w:tcMar>
+              <w:top w:type="dxa" w:w="60"/>
+              <w:left w:type="dxa" w:w="100"/>
+              <w:bottom w:type="dxa" w:w="60"/>
+              <w:right w:type="dxa" w:w="100"/>
+            </w:tcMar>
+          </w:tcPr>
+          <w:p>
+            <w:pPr>
+              <w:spacing w:after="0" w:before="0"/>
+            </w:pPr>
+            <w:r>
+              <w:rPr>
+                <w:sz w:val="18"/>
+                <w:szCs w:val="18"/>
+              </w:rPr>
+              <w:t xml:space="preserve">Slider / TextBlock</w:t>
+            </w:r>
+          </w:p>
+        </w:tc>
+      </w:tr>
+      <w:tr>
+        <w:trPr>
+          <w:tblHeader w:val="off"/>
+        </w:trPr>
+        <w:tc>
+          <w:tcPr>
+            <w:tcW w:type="dxa" w:w="3275"/>
+            <w:tcBorders>
+              <w:top w:val="single" w:color="BFBFBF" w:sz="4"/>
+              <w:left w:val="single" w:color="BFBFBF" w:sz="4"/>
+              <w:bottom w:val="single" w:color="BFBFBF" w:sz="4"/>
+              <w:right w:val="single" w:color="BFBFBF" w:sz="4"/>
+            </w:tcBorders>
+            <w:tcMar>
+              <w:top w:type="dxa" w:w="60"/>
+              <w:left w:type="dxa" w:w="100"/>
+              <w:bottom w:type="dxa" w:w="60"/>
+              <w:right w:type="dxa" w:w="100"/>
+            </w:tcMar>
+          </w:tcPr>
+          <w:p>
+            <w:pPr>
+              <w:spacing w:after="0" w:before="0"/>
+            </w:pPr>
+            <w:r>
+              <w:rPr>
+                <w:sz w:val="18"/>
+                <w:szCs w:val="18"/>
+              </w:rPr>
+              <w:t xml:space="preserve">CmbKernelSize</w:t>
+            </w:r>
+          </w:p>
+        </w:tc>
+        <w:tc>
+          <w:tcPr>
+            <w:tcW w:type="dxa" w:w="2620"/>
+            <w:tcBorders>
+              <w:top w:val="single" w:color="BFBFBF" w:sz="4"/>
+              <w:left w:val="single" w:color="BFBFBF" w:sz="4"/>
+              <w:bottom w:val="single" w:color="BFBFBF" w:sz="4"/>
+              <w:right w:val="single" w:color="BFBFBF" w:sz="4"/>
+            </w:tcBorders>
+            <w:tcMar>
+              <w:top w:type="dxa" w:w="60"/>
+              <w:left w:type="dxa" w:w="100"/>
+              <w:bottom w:type="dxa" w:w="60"/>
+              <w:right w:type="dxa" w:w="100"/>
+            </w:tcMar>
+          </w:tcPr>
+          <w:p>
+            <w:pPr>
+              <w:spacing w:after="0" w:before="0"/>
+            </w:pPr>
+            <w:r>
+              <w:rPr>
+                <w:rFonts w:ascii="Consolas" w:eastAsia="맑은 고딕" w:hAnsi="Consolas"/>
+                <w:color w:val="A31515"/>
+                <w:sz w:val="18"/>
+                <w:szCs w:val="18"/>
+                <w:shd w:fill="F2F2F2" w:color="auto" w:val="clear"/>
+              </w:rPr>
               <w:t xml:space="preserve">CmbKernel</w:t>
             </w:r>
           </w:p>
         </w:tc>
         <w:tc>
           <w:tcPr>
-            <w:tcW w:type="dxa" w:w="2170"/>
+            <w:tcW w:type="dxa" w:w="3743"/>
             <w:tcBorders>
               <w:top w:val="single" w:color="BFBFBF" w:sz="4"/>
               <w:left w:val="single" w:color="BFBFBF" w:sz="4"/>
@@ -7036,9 +7148,9 @@
         </w:tblBorders>
       </w:tblPr>
       <w:tblGrid>
-        <w:gridCol w:w="3988"/>
-        <w:gridCol w:w="1795"/>
-        <w:gridCol w:w="3855"/>
+        <w:gridCol w:w="3934"/>
+        <w:gridCol w:w="1770"/>
+        <w:gridCol w:w="3934"/>
       </w:tblGrid>
       <w:tr>
         <w:trPr>
@@ -7046,7 +7158,7 @@
         </w:trPr>
         <w:tc>
           <w:tcPr>
-            <w:tcW w:type="dxa" w:w="3988"/>
+            <w:tcW w:type="dxa" w:w="3934"/>
             <w:tcBorders>
               <w:top w:val="single" w:color="BFBFBF" w:sz="4"/>
               <w:left w:val="single" w:color="BFBFBF" w:sz="4"/>
@@ -7078,7 +7190,7 @@
         </w:tc>
         <w:tc>
           <w:tcPr>
-            <w:tcW w:type="dxa" w:w="1795"/>
+            <w:tcW w:type="dxa" w:w="1770"/>
             <w:tcBorders>
               <w:top w:val="single" w:color="BFBFBF" w:sz="4"/>
               <w:left w:val="single" w:color="BFBFBF" w:sz="4"/>
@@ -7110,7 +7222,7 @@
         </w:tc>
         <w:tc>
           <w:tcPr>
-            <w:tcW w:type="dxa" w:w="3855"/>
+            <w:tcW w:type="dxa" w:w="3934"/>
             <w:tcBorders>
               <w:top w:val="single" w:color="BFBFBF" w:sz="4"/>
               <w:left w:val="single" w:color="BFBFBF" w:sz="4"/>
@@ -7147,7 +7259,7 @@
         </w:trPr>
         <w:tc>
           <w:tcPr>
-            <w:tcW w:type="dxa" w:w="3988"/>
+            <w:tcW w:type="dxa" w:w="3934"/>
             <w:tcBorders>
               <w:top w:val="single" w:color="BFBFBF" w:sz="4"/>
               <w:left w:val="single" w:color="BFBFBF" w:sz="4"/>
@@ -7220,7 +7332,7 @@
         </w:tc>
         <w:tc>
           <w:tcPr>
-            <w:tcW w:type="dxa" w:w="1795"/>
+            <w:tcW w:type="dxa" w:w="1770"/>
             <w:tcBorders>
               <w:top w:val="single" w:color="BFBFBF" w:sz="4"/>
               <w:left w:val="single" w:color="BFBFBF" w:sz="4"/>
@@ -7249,7 +7361,7 @@
         </w:tc>
         <w:tc>
           <w:tcPr>
-            <w:tcW w:type="dxa" w:w="3855"/>
+            <w:tcW w:type="dxa" w:w="3934"/>
             <w:tcBorders>
               <w:top w:val="single" w:color="BFBFBF" w:sz="4"/>
               <w:left w:val="single" w:color="BFBFBF" w:sz="4"/>
@@ -7320,7 +7432,7 @@
         </w:trPr>
         <w:tc>
           <w:tcPr>
-            <w:tcW w:type="dxa" w:w="3988"/>
+            <w:tcW w:type="dxa" w:w="3934"/>
             <w:tcBorders>
               <w:top w:val="single" w:color="BFBFBF" w:sz="4"/>
               <w:left w:val="single" w:color="BFBFBF" w:sz="4"/>
@@ -7359,7 +7471,7 @@
         </w:tc>
         <w:tc>
           <w:tcPr>
-            <w:tcW w:type="dxa" w:w="1795"/>
+            <w:tcW w:type="dxa" w:w="1770"/>
             <w:tcBorders>
               <w:top w:val="single" w:color="BFBFBF" w:sz="4"/>
               <w:left w:val="single" w:color="BFBFBF" w:sz="4"/>
@@ -7388,7 +7500,7 @@
         </w:tc>
         <w:tc>
           <w:tcPr>
-            <w:tcW w:type="dxa" w:w="3855"/>
+            <w:tcW w:type="dxa" w:w="3934"/>
             <w:tcBorders>
               <w:top w:val="single" w:color="BFBFBF" w:sz="4"/>
               <w:left w:val="single" w:color="BFBFBF" w:sz="4"/>
@@ -7422,7 +7534,7 @@
         </w:trPr>
         <w:tc>
           <w:tcPr>
-            <w:tcW w:type="dxa" w:w="3988"/>
+            <w:tcW w:type="dxa" w:w="3934"/>
             <w:tcBorders>
               <w:top w:val="single" w:color="BFBFBF" w:sz="4"/>
               <w:left w:val="single" w:color="BFBFBF" w:sz="4"/>
@@ -7505,7 +7617,7 @@
         </w:tc>
         <w:tc>
           <w:tcPr>
-            <w:tcW w:type="dxa" w:w="1795"/>
+            <w:tcW w:type="dxa" w:w="1770"/>
             <w:tcBorders>
               <w:top w:val="single" w:color="BFBFBF" w:sz="4"/>
               <w:left w:val="single" w:color="BFBFBF" w:sz="4"/>
@@ -7534,7 +7646,7 @@
         </w:tc>
         <w:tc>
           <w:tcPr>
-            <w:tcW w:type="dxa" w:w="3855"/>
+            <w:tcW w:type="dxa" w:w="3934"/>
             <w:tcBorders>
               <w:top w:val="single" w:color="BFBFBF" w:sz="4"/>
               <w:left w:val="single" w:color="BFBFBF" w:sz="4"/>
@@ -7567,7 +7679,41 @@
                 <w:sz w:val="18"/>
                 <w:szCs w:val="18"/>
               </w:rPr>
-              <w:t xml:space="preserve"> → 매개변수 없이 필드 사용</w:t>
+              <w:t xml:space="preserve"> → </w:t>
+            </w:r>
+            <w:r>
+              <w:rPr>
+                <w:rFonts w:ascii="Consolas" w:eastAsia="맑은 고딕" w:hAnsi="Consolas"/>
+                <w:color w:val="A31515"/>
+                <w:sz w:val="18"/>
+                <w:szCs w:val="18"/>
+                <w:shd w:fill="F2F2F2" w:color="auto" w:val="clear"/>
+              </w:rPr>
+              <w:t xml:space="preserve">UpdateRoiMarks()</w:t>
+            </w:r>
+            <w:r>
+              <w:rPr>
+                <w:sz w:val="18"/>
+                <w:szCs w:val="18"/>
+              </w:rPr>
+              <w:t xml:space="preserve"> + </w:t>
+            </w:r>
+            <w:r>
+              <w:rPr>
+                <w:rFonts w:ascii="Consolas" w:eastAsia="맑은 고딕" w:hAnsi="Consolas"/>
+                <w:color w:val="A31515"/>
+                <w:sz w:val="18"/>
+                <w:szCs w:val="18"/>
+                <w:shd w:fill="F2F2F2" w:color="auto" w:val="clear"/>
+              </w:rPr>
+              <w:t xml:space="preserve">ShowRoiOnCanvas(canvas, rect)</w:t>
+            </w:r>
+            <w:r>
+              <w:rPr>
+                <w:sz w:val="18"/>
+                <w:szCs w:val="18"/>
+              </w:rPr>
+              <w:t xml:space="preserve"> (Viewer1/Viewer2/Navigator 공통)</w:t>
             </w:r>
           </w:p>
         </w:tc>
@@ -7578,7 +7724,7 @@
         </w:trPr>
         <w:tc>
           <w:tcPr>
-            <w:tcW w:type="dxa" w:w="3988"/>
+            <w:tcW w:type="dxa" w:w="3934"/>
             <w:tcBorders>
               <w:top w:val="single" w:color="BFBFBF" w:sz="4"/>
               <w:left w:val="single" w:color="BFBFBF" w:sz="4"/>
@@ -7617,7 +7763,7 @@
         </w:tc>
         <w:tc>
           <w:tcPr>
-            <w:tcW w:type="dxa" w:w="1795"/>
+            <w:tcW w:type="dxa" w:w="1770"/>
             <w:tcBorders>
               <w:top w:val="single" w:color="BFBFBF" w:sz="4"/>
               <w:left w:val="single" w:color="BFBFBF" w:sz="4"/>
@@ -7646,7 +7792,7 @@
         </w:tc>
         <w:tc>
           <w:tcPr>
-            <w:tcW w:type="dxa" w:w="3855"/>
+            <w:tcW w:type="dxa" w:w="3934"/>
             <w:tcBorders>
               <w:top w:val="single" w:color="BFBFBF" w:sz="4"/>
               <w:left w:val="single" w:color="BFBFBF" w:sz="4"/>
@@ -7680,7 +7826,7 @@
         </w:trPr>
         <w:tc>
           <w:tcPr>
-            <w:tcW w:type="dxa" w:w="3988"/>
+            <w:tcW w:type="dxa" w:w="3934"/>
             <w:tcBorders>
               <w:top w:val="single" w:color="BFBFBF" w:sz="4"/>
               <w:left w:val="single" w:color="BFBFBF" w:sz="4"/>
@@ -7848,7 +7994,7 @@
         </w:tc>
         <w:tc>
           <w:tcPr>
-            <w:tcW w:type="dxa" w:w="1795"/>
+            <w:tcW w:type="dxa" w:w="1770"/>
             <w:tcBorders>
               <w:top w:val="single" w:color="BFBFBF" w:sz="4"/>
               <w:left w:val="single" w:color="BFBFBF" w:sz="4"/>
@@ -7877,7 +8023,7 @@
         </w:tc>
         <w:tc>
           <w:tcPr>
-            <w:tcW w:type="dxa" w:w="3855"/>
+            <w:tcW w:type="dxa" w:w="3934"/>
             <w:tcBorders>
               <w:top w:val="single" w:color="BFBFBF" w:sz="4"/>
               <w:left w:val="single" w:color="BFBFBF" w:sz="4"/>
@@ -7911,7 +8057,7 @@
         </w:trPr>
         <w:tc>
           <w:tcPr>
-            <w:tcW w:type="dxa" w:w="3988"/>
+            <w:tcW w:type="dxa" w:w="3934"/>
             <w:tcBorders>
               <w:top w:val="single" w:color="BFBFBF" w:sz="4"/>
               <w:left w:val="single" w:color="BFBFBF" w:sz="4"/>
@@ -7950,7 +8096,7 @@
         </w:tc>
         <w:tc>
           <w:tcPr>
-            <w:tcW w:type="dxa" w:w="1795"/>
+            <w:tcW w:type="dxa" w:w="1770"/>
             <w:tcBorders>
               <w:top w:val="single" w:color="BFBFBF" w:sz="4"/>
               <w:left w:val="single" w:color="BFBFBF" w:sz="4"/>
@@ -7979,7 +8125,7 @@
         </w:tc>
         <w:tc>
           <w:tcPr>
-            <w:tcW w:type="dxa" w:w="3855"/>
+            <w:tcW w:type="dxa" w:w="3934"/>
             <w:tcBorders>
               <w:top w:val="single" w:color="BFBFBF" w:sz="4"/>
               <w:left w:val="single" w:color="BFBFBF" w:sz="4"/>
@@ -8023,7 +8169,7 @@
         </w:trPr>
         <w:tc>
           <w:tcPr>
-            <w:tcW w:type="dxa" w:w="3988"/>
+            <w:tcW w:type="dxa" w:w="3934"/>
             <w:tcBorders>
               <w:top w:val="single" w:color="BFBFBF" w:sz="4"/>
               <w:left w:val="single" w:color="BFBFBF" w:sz="4"/>
@@ -8089,7 +8235,7 @@
         </w:tc>
         <w:tc>
           <w:tcPr>
-            <w:tcW w:type="dxa" w:w="1795"/>
+            <w:tcW w:type="dxa" w:w="1770"/>
             <w:tcBorders>
               <w:top w:val="single" w:color="BFBFBF" w:sz="4"/>
               <w:left w:val="single" w:color="BFBFBF" w:sz="4"/>
@@ -8118,7 +8264,7 @@
         </w:tc>
         <w:tc>
           <w:tcPr>
-            <w:tcW w:type="dxa" w:w="3855"/>
+            <w:tcW w:type="dxa" w:w="3934"/>
             <w:tcBorders>
               <w:top w:val="single" w:color="BFBFBF" w:sz="4"/>
               <w:left w:val="single" w:color="BFBFBF" w:sz="4"/>
@@ -10948,9 +11094,9 @@
         </w:tblBorders>
       </w:tblPr>
       <w:tblGrid>
-        <w:gridCol w:w="2519"/>
-        <w:gridCol w:w="1752"/>
-        <w:gridCol w:w="5367"/>
+        <w:gridCol w:w="2239"/>
+        <w:gridCol w:w="1558"/>
+        <w:gridCol w:w="5841"/>
       </w:tblGrid>
       <w:tr>
         <w:trPr>
@@ -10958,7 +11104,7 @@
         </w:trPr>
         <w:tc>
           <w:tcPr>
-            <w:tcW w:type="dxa" w:w="2519"/>
+            <w:tcW w:type="dxa" w:w="2239"/>
             <w:tcBorders>
               <w:top w:val="single" w:color="BFBFBF" w:sz="4"/>
               <w:left w:val="single" w:color="BFBFBF" w:sz="4"/>
@@ -10990,7 +11136,7 @@
         </w:tc>
         <w:tc>
           <w:tcPr>
-            <w:tcW w:type="dxa" w:w="1752"/>
+            <w:tcW w:type="dxa" w:w="1558"/>
             <w:tcBorders>
               <w:top w:val="single" w:color="BFBFBF" w:sz="4"/>
               <w:left w:val="single" w:color="BFBFBF" w:sz="4"/>
@@ -11022,7 +11168,7 @@
         </w:tc>
         <w:tc>
           <w:tcPr>
-            <w:tcW w:type="dxa" w:w="5367"/>
+            <w:tcW w:type="dxa" w:w="5841"/>
             <w:tcBorders>
               <w:top w:val="single" w:color="BFBFBF" w:sz="4"/>
               <w:left w:val="single" w:color="BFBFBF" w:sz="4"/>
@@ -11059,7 +11205,7 @@
         </w:trPr>
         <w:tc>
           <w:tcPr>
-            <w:tcW w:type="dxa" w:w="2519"/>
+            <w:tcW w:type="dxa" w:w="2239"/>
             <w:tcBorders>
               <w:top w:val="single" w:color="BFBFBF" w:sz="4"/>
               <w:left w:val="single" w:color="BFBFBF" w:sz="4"/>
@@ -11091,7 +11237,7 @@
         </w:tc>
         <w:tc>
           <w:tcPr>
-            <w:tcW w:type="dxa" w:w="1752"/>
+            <w:tcW w:type="dxa" w:w="1558"/>
             <w:tcBorders>
               <w:top w:val="single" w:color="BFBFBF" w:sz="4"/>
               <w:left w:val="single" w:color="BFBFBF" w:sz="4"/>
@@ -11120,7 +11266,7 @@
         </w:tc>
         <w:tc>
           <w:tcPr>
-            <w:tcW w:type="dxa" w:w="5367"/>
+            <w:tcW w:type="dxa" w:w="5841"/>
             <w:tcBorders>
               <w:top w:val="single" w:color="BFBFBF" w:sz="4"/>
               <w:left w:val="single" w:color="BFBFBF" w:sz="4"/>
@@ -11154,7 +11300,7 @@
         </w:trPr>
         <w:tc>
           <w:tcPr>
-            <w:tcW w:type="dxa" w:w="2519"/>
+            <w:tcW w:type="dxa" w:w="2239"/>
             <w:tcBorders>
               <w:top w:val="single" w:color="BFBFBF" w:sz="4"/>
               <w:left w:val="single" w:color="BFBFBF" w:sz="4"/>
@@ -11186,7 +11332,7 @@
         </w:tc>
         <w:tc>
           <w:tcPr>
-            <w:tcW w:type="dxa" w:w="1752"/>
+            <w:tcW w:type="dxa" w:w="1558"/>
             <w:tcBorders>
               <w:top w:val="single" w:color="BFBFBF" w:sz="4"/>
               <w:left w:val="single" w:color="BFBFBF" w:sz="4"/>
@@ -11215,7 +11361,7 @@
         </w:tc>
         <w:tc>
           <w:tcPr>
-            <w:tcW w:type="dxa" w:w="5367"/>
+            <w:tcW w:type="dxa" w:w="5841"/>
             <w:tcBorders>
               <w:top w:val="single" w:color="BFBFBF" w:sz="4"/>
               <w:left w:val="single" w:color="BFBFBF" w:sz="4"/>
@@ -11249,7 +11395,7 @@
         </w:trPr>
         <w:tc>
           <w:tcPr>
-            <w:tcW w:type="dxa" w:w="2519"/>
+            <w:tcW w:type="dxa" w:w="2239"/>
             <w:tcBorders>
               <w:top w:val="single" w:color="BFBFBF" w:sz="4"/>
               <w:left w:val="single" w:color="BFBFBF" w:sz="4"/>
@@ -11281,7 +11427,7 @@
         </w:tc>
         <w:tc>
           <w:tcPr>
-            <w:tcW w:type="dxa" w:w="1752"/>
+            <w:tcW w:type="dxa" w:w="1558"/>
             <w:tcBorders>
               <w:top w:val="single" w:color="BFBFBF" w:sz="4"/>
               <w:left w:val="single" w:color="BFBFBF" w:sz="4"/>
@@ -11310,7 +11456,7 @@
         </w:tc>
         <w:tc>
           <w:tcPr>
-            <w:tcW w:type="dxa" w:w="5367"/>
+            <w:tcW w:type="dxa" w:w="5841"/>
             <w:tcBorders>
               <w:top w:val="single" w:color="BFBFBF" w:sz="4"/>
               <w:left w:val="single" w:color="BFBFBF" w:sz="4"/>
@@ -11344,7 +11490,7 @@
         </w:trPr>
         <w:tc>
           <w:tcPr>
-            <w:tcW w:type="dxa" w:w="2519"/>
+            <w:tcW w:type="dxa" w:w="2239"/>
             <w:tcBorders>
               <w:top w:val="single" w:color="BFBFBF" w:sz="4"/>
               <w:left w:val="single" w:color="BFBFBF" w:sz="4"/>
@@ -11376,7 +11522,7 @@
         </w:tc>
         <w:tc>
           <w:tcPr>
-            <w:tcW w:type="dxa" w:w="1752"/>
+            <w:tcW w:type="dxa" w:w="1558"/>
             <w:tcBorders>
               <w:top w:val="single" w:color="BFBFBF" w:sz="4"/>
               <w:left w:val="single" w:color="BFBFBF" w:sz="4"/>
@@ -11405,7 +11551,7 @@
         </w:tc>
         <w:tc>
           <w:tcPr>
-            <w:tcW w:type="dxa" w:w="5367"/>
+            <w:tcW w:type="dxa" w:w="5841"/>
             <w:tcBorders>
               <w:top w:val="single" w:color="BFBFBF" w:sz="4"/>
               <w:left w:val="single" w:color="BFBFBF" w:sz="4"/>
@@ -11439,7 +11585,7 @@
         </w:trPr>
         <w:tc>
           <w:tcPr>
-            <w:tcW w:type="dxa" w:w="2519"/>
+            <w:tcW w:type="dxa" w:w="2239"/>
             <w:tcBorders>
               <w:top w:val="single" w:color="BFBFBF" w:sz="4"/>
               <w:left w:val="single" w:color="BFBFBF" w:sz="4"/>
@@ -11471,7 +11617,7 @@
         </w:tc>
         <w:tc>
           <w:tcPr>
-            <w:tcW w:type="dxa" w:w="1752"/>
+            <w:tcW w:type="dxa" w:w="1558"/>
             <w:tcBorders>
               <w:top w:val="single" w:color="BFBFBF" w:sz="4"/>
               <w:left w:val="single" w:color="BFBFBF" w:sz="4"/>
@@ -11500,7 +11646,7 @@
         </w:tc>
         <w:tc>
           <w:tcPr>
-            <w:tcW w:type="dxa" w:w="5367"/>
+            <w:tcW w:type="dxa" w:w="5841"/>
             <w:tcBorders>
               <w:top w:val="single" w:color="BFBFBF" w:sz="4"/>
               <w:left w:val="single" w:color="BFBFBF" w:sz="4"/>
@@ -11534,7 +11680,7 @@
         </w:trPr>
         <w:tc>
           <w:tcPr>
-            <w:tcW w:type="dxa" w:w="2519"/>
+            <w:tcW w:type="dxa" w:w="2239"/>
             <w:tcBorders>
               <w:top w:val="single" w:color="BFBFBF" w:sz="4"/>
               <w:left w:val="single" w:color="BFBFBF" w:sz="4"/>
@@ -11560,13 +11706,13 @@
                 <w:szCs w:val="18"/>
                 <w:shd w:fill="F2F2F2" w:color="auto" w:val="clear"/>
               </w:rPr>
-              <w:t xml:space="preserve">UpdateNavigatorRoi</w:t>
-            </w:r>
-          </w:p>
-        </w:tc>
-        <w:tc>
-          <w:tcPr>
-            <w:tcW w:type="dxa" w:w="1752"/>
+              <w:t xml:space="preserve">UpdateRoiMarks</w:t>
+            </w:r>
+          </w:p>
+        </w:tc>
+        <w:tc>
+          <w:tcPr>
+            <w:tcW w:type="dxa" w:w="1558"/>
             <w:tcBorders>
               <w:top w:val="single" w:color="BFBFBF" w:sz="4"/>
               <w:left w:val="single" w:color="BFBFBF" w:sz="4"/>
@@ -11595,30 +11741,30 @@
         </w:tc>
         <w:tc>
           <w:tcPr>
-            <w:tcW w:type="dxa" w:w="5367"/>
-            <w:tcBorders>
-              <w:top w:val="single" w:color="BFBFBF" w:sz="4"/>
-              <w:left w:val="single" w:color="BFBFBF" w:sz="4"/>
-              <w:bottom w:val="single" w:color="BFBFBF" w:sz="4"/>
-              <w:right w:val="single" w:color="BFBFBF" w:sz="4"/>
-            </w:tcBorders>
-            <w:tcMar>
-              <w:top w:type="dxa" w:w="60"/>
-              <w:left w:type="dxa" w:w="100"/>
-              <w:bottom w:type="dxa" w:w="60"/>
-              <w:right w:type="dxa" w:w="100"/>
-            </w:tcMar>
-          </w:tcPr>
-          <w:p>
-            <w:pPr>
-              <w:spacing w:after="0" w:before="0"/>
-            </w:pPr>
-            <w:r>
-              <w:rPr>
-                <w:sz w:val="18"/>
-                <w:szCs w:val="18"/>
-              </w:rPr>
-              <w:t xml:space="preserve">이미지 좌표 → 네비게이터 좌표로 바꿔 빨간 사각형 표시</w:t>
+            <w:tcW w:type="dxa" w:w="5841"/>
+            <w:tcBorders>
+              <w:top w:val="single" w:color="BFBFBF" w:sz="4"/>
+              <w:left w:val="single" w:color="BFBFBF" w:sz="4"/>
+              <w:bottom w:val="single" w:color="BFBFBF" w:sz="4"/>
+              <w:right w:val="single" w:color="BFBFBF" w:sz="4"/>
+            </w:tcBorders>
+            <w:tcMar>
+              <w:top w:type="dxa" w:w="60"/>
+              <w:left w:type="dxa" w:w="100"/>
+              <w:bottom w:type="dxa" w:w="60"/>
+              <w:right w:type="dxa" w:w="100"/>
+            </w:tcMar>
+          </w:tcPr>
+          <w:p>
+            <w:pPr>
+              <w:spacing w:after="0" w:before="0"/>
+            </w:pPr>
+            <w:r>
+              <w:rPr>
+                <w:sz w:val="18"/>
+                <w:szCs w:val="18"/>
+              </w:rPr>
+              <w:t xml:space="preserve">Viewer1, Viewer2, Navigator 세 곳의 ROI 사각형을 다시 그림 (ROI가 없으면 숨김)</w:t>
             </w:r>
           </w:p>
         </w:tc>
@@ -11629,7 +11775,7 @@
         </w:trPr>
         <w:tc>
           <w:tcPr>
-            <w:tcW w:type="dxa" w:w="2519"/>
+            <w:tcW w:type="dxa" w:w="2239"/>
             <w:tcBorders>
               <w:top w:val="single" w:color="BFBFBF" w:sz="4"/>
               <w:left w:val="single" w:color="BFBFBF" w:sz="4"/>
@@ -11655,65 +11801,65 @@
                 <w:szCs w:val="18"/>
                 <w:shd w:fill="F2F2F2" w:color="auto" w:val="clear"/>
               </w:rPr>
-              <w:t xml:space="preserve">UpdateHistogram</w:t>
-            </w:r>
-          </w:p>
-        </w:tc>
-        <w:tc>
-          <w:tcPr>
-            <w:tcW w:type="dxa" w:w="1752"/>
-            <w:tcBorders>
-              <w:top w:val="single" w:color="BFBFBF" w:sz="4"/>
-              <w:left w:val="single" w:color="BFBFBF" w:sz="4"/>
-              <w:bottom w:val="single" w:color="BFBFBF" w:sz="4"/>
-              <w:right w:val="single" w:color="BFBFBF" w:sz="4"/>
-            </w:tcBorders>
-            <w:tcMar>
-              <w:top w:type="dxa" w:w="60"/>
-              <w:left w:type="dxa" w:w="100"/>
-              <w:bottom w:type="dxa" w:w="60"/>
-              <w:right w:type="dxa" w:w="100"/>
-            </w:tcMar>
-          </w:tcPr>
-          <w:p>
-            <w:pPr>
-              <w:spacing w:after="0" w:before="0"/>
-            </w:pPr>
-            <w:r>
-              <w:rPr>
-                <w:sz w:val="18"/>
-                <w:szCs w:val="18"/>
-              </w:rPr>
-              <w:t xml:space="preserve">Histogram.cs</w:t>
-            </w:r>
-          </w:p>
-        </w:tc>
-        <w:tc>
-          <w:tcPr>
-            <w:tcW w:type="dxa" w:w="5367"/>
-            <w:tcBorders>
-              <w:top w:val="single" w:color="BFBFBF" w:sz="4"/>
-              <w:left w:val="single" w:color="BFBFBF" w:sz="4"/>
-              <w:bottom w:val="single" w:color="BFBFBF" w:sz="4"/>
-              <w:right w:val="single" w:color="BFBFBF" w:sz="4"/>
-            </w:tcBorders>
-            <w:tcMar>
-              <w:top w:type="dxa" w:w="60"/>
-              <w:left w:type="dxa" w:w="100"/>
-              <w:bottom w:type="dxa" w:w="60"/>
-              <w:right w:type="dxa" w:w="100"/>
-            </w:tcMar>
-          </w:tcPr>
-          <w:p>
-            <w:pPr>
-              <w:spacing w:after="0" w:before="0"/>
-            </w:pPr>
-            <w:r>
-              <w:rPr>
-                <w:sz w:val="18"/>
-                <w:szCs w:val="18"/>
-              </w:rPr>
-              <w:t xml:space="preserve">어떤 영상(원본/채널/결과)의 어떤 영역(ROI/전체)인지 정해서 계산 요청 후 그리기</w:t>
+              <w:t xml:space="preserve">ShowRoiOnCanvas</w:t>
+            </w:r>
+          </w:p>
+        </w:tc>
+        <w:tc>
+          <w:tcPr>
+            <w:tcW w:type="dxa" w:w="1558"/>
+            <w:tcBorders>
+              <w:top w:val="single" w:color="BFBFBF" w:sz="4"/>
+              <w:left w:val="single" w:color="BFBFBF" w:sz="4"/>
+              <w:bottom w:val="single" w:color="BFBFBF" w:sz="4"/>
+              <w:right w:val="single" w:color="BFBFBF" w:sz="4"/>
+            </w:tcBorders>
+            <w:tcMar>
+              <w:top w:type="dxa" w:w="60"/>
+              <w:left w:type="dxa" w:w="100"/>
+              <w:bottom w:type="dxa" w:w="60"/>
+              <w:right w:type="dxa" w:w="100"/>
+            </w:tcMar>
+          </w:tcPr>
+          <w:p>
+            <w:pPr>
+              <w:spacing w:after="0" w:before="0"/>
+            </w:pPr>
+            <w:r>
+              <w:rPr>
+                <w:sz w:val="18"/>
+                <w:szCs w:val="18"/>
+              </w:rPr>
+              <w:t xml:space="preserve">Roi.cs</w:t>
+            </w:r>
+          </w:p>
+        </w:tc>
+        <w:tc>
+          <w:tcPr>
+            <w:tcW w:type="dxa" w:w="5841"/>
+            <w:tcBorders>
+              <w:top w:val="single" w:color="BFBFBF" w:sz="4"/>
+              <w:left w:val="single" w:color="BFBFBF" w:sz="4"/>
+              <w:bottom w:val="single" w:color="BFBFBF" w:sz="4"/>
+              <w:right w:val="single" w:color="BFBFBF" w:sz="4"/>
+            </w:tcBorders>
+            <w:tcMar>
+              <w:top w:type="dxa" w:w="60"/>
+              <w:left w:type="dxa" w:w="100"/>
+              <w:bottom w:type="dxa" w:w="60"/>
+              <w:right w:type="dxa" w:w="100"/>
+            </w:tcMar>
+          </w:tcPr>
+          <w:p>
+            <w:pPr>
+              <w:spacing w:after="0" w:before="0"/>
+            </w:pPr>
+            <w:r>
+              <w:rPr>
+                <w:sz w:val="18"/>
+                <w:szCs w:val="18"/>
+              </w:rPr>
+              <w:t xml:space="preserve">이미지 픽셀 좌표 ROI → 해당 Canvas의 화면 좌표로 바꿔 사각형 표시</w:t>
             </w:r>
           </w:p>
         </w:tc>
@@ -11724,7 +11870,7 @@
         </w:trPr>
         <w:tc>
           <w:tcPr>
-            <w:tcW w:type="dxa" w:w="2519"/>
+            <w:tcW w:type="dxa" w:w="2239"/>
             <w:tcBorders>
               <w:top w:val="single" w:color="BFBFBF" w:sz="4"/>
               <w:left w:val="single" w:color="BFBFBF" w:sz="4"/>
@@ -11750,13 +11896,13 @@
                 <w:szCs w:val="18"/>
                 <w:shd w:fill="F2F2F2" w:color="auto" w:val="clear"/>
               </w:rPr>
-              <w:t xml:space="preserve">DrawHistogramBoxes</w:t>
-            </w:r>
-          </w:p>
-        </w:tc>
-        <w:tc>
-          <w:tcPr>
-            <w:tcW w:type="dxa" w:w="1752"/>
+              <w:t xml:space="preserve">UpdateHistogram</w:t>
+            </w:r>
+          </w:p>
+        </w:tc>
+        <w:tc>
+          <w:tcPr>
+            <w:tcW w:type="dxa" w:w="1558"/>
             <w:tcBorders>
               <w:top w:val="single" w:color="BFBFBF" w:sz="4"/>
               <w:left w:val="single" w:color="BFBFBF" w:sz="4"/>
@@ -11785,30 +11931,30 @@
         </w:tc>
         <w:tc>
           <w:tcPr>
-            <w:tcW w:type="dxa" w:w="5367"/>
-            <w:tcBorders>
-              <w:top w:val="single" w:color="BFBFBF" w:sz="4"/>
-              <w:left w:val="single" w:color="BFBFBF" w:sz="4"/>
-              <w:bottom w:val="single" w:color="BFBFBF" w:sz="4"/>
-              <w:right w:val="single" w:color="BFBFBF" w:sz="4"/>
-            </w:tcBorders>
-            <w:tcMar>
-              <w:top w:type="dxa" w:w="60"/>
-              <w:left w:type="dxa" w:w="100"/>
-              <w:bottom w:type="dxa" w:w="60"/>
-              <w:right w:type="dxa" w:w="100"/>
-            </w:tcMar>
-          </w:tcPr>
-          <w:p>
-            <w:pPr>
-              <w:spacing w:after="0" w:before="0"/>
-            </w:pPr>
-            <w:r>
-              <w:rPr>
-                <w:sz w:val="18"/>
-                <w:szCs w:val="18"/>
-              </w:rPr>
-              <w:t xml:space="preserve">256개 막대를 Canvas에 그림</w:t>
+            <w:tcW w:type="dxa" w:w="5841"/>
+            <w:tcBorders>
+              <w:top w:val="single" w:color="BFBFBF" w:sz="4"/>
+              <w:left w:val="single" w:color="BFBFBF" w:sz="4"/>
+              <w:bottom w:val="single" w:color="BFBFBF" w:sz="4"/>
+              <w:right w:val="single" w:color="BFBFBF" w:sz="4"/>
+            </w:tcBorders>
+            <w:tcMar>
+              <w:top w:type="dxa" w:w="60"/>
+              <w:left w:type="dxa" w:w="100"/>
+              <w:bottom w:type="dxa" w:w="60"/>
+              <w:right w:type="dxa" w:w="100"/>
+            </w:tcMar>
+          </w:tcPr>
+          <w:p>
+            <w:pPr>
+              <w:spacing w:after="0" w:before="0"/>
+            </w:pPr>
+            <w:r>
+              <w:rPr>
+                <w:sz w:val="18"/>
+                <w:szCs w:val="18"/>
+              </w:rPr>
+              <w:t xml:space="preserve">어떤 영상(원본/채널/결과)의 어떤 영역(ROI/전체)인지 정해서 계산 요청 후 그리기</w:t>
             </w:r>
           </w:p>
         </w:tc>
@@ -11819,7 +11965,7 @@
         </w:trPr>
         <w:tc>
           <w:tcPr>
-            <w:tcW w:type="dxa" w:w="2519"/>
+            <w:tcW w:type="dxa" w:w="2239"/>
             <w:tcBorders>
               <w:top w:val="single" w:color="BFBFBF" w:sz="4"/>
               <w:left w:val="single" w:color="BFBFBF" w:sz="4"/>
@@ -11845,13 +11991,13 @@
                 <w:szCs w:val="18"/>
                 <w:shd w:fill="F2F2F2" w:color="auto" w:val="clear"/>
               </w:rPr>
-              <w:t xml:space="preserve">ApplySelectedChannel</w:t>
-            </w:r>
-          </w:p>
-        </w:tc>
-        <w:tc>
-          <w:tcPr>
-            <w:tcW w:type="dxa" w:w="1752"/>
+              <w:t xml:space="preserve">DrawHistogramBoxes</w:t>
+            </w:r>
+          </w:p>
+        </w:tc>
+        <w:tc>
+          <w:tcPr>
+            <w:tcW w:type="dxa" w:w="1558"/>
             <w:tcBorders>
               <w:top w:val="single" w:color="BFBFBF" w:sz="4"/>
               <w:left w:val="single" w:color="BFBFBF" w:sz="4"/>
@@ -11880,30 +12026,30 @@
         </w:tc>
         <w:tc>
           <w:tcPr>
-            <w:tcW w:type="dxa" w:w="5367"/>
-            <w:tcBorders>
-              <w:top w:val="single" w:color="BFBFBF" w:sz="4"/>
-              <w:left w:val="single" w:color="BFBFBF" w:sz="4"/>
-              <w:bottom w:val="single" w:color="BFBFBF" w:sz="4"/>
-              <w:right w:val="single" w:color="BFBFBF" w:sz="4"/>
-            </w:tcBorders>
-            <w:tcMar>
-              <w:top w:type="dxa" w:w="60"/>
-              <w:left w:type="dxa" w:w="100"/>
-              <w:bottom w:type="dxa" w:w="60"/>
-              <w:right w:type="dxa" w:w="100"/>
-            </w:tcMar>
-          </w:tcPr>
-          <w:p>
-            <w:pPr>
-              <w:spacing w:after="0" w:before="0"/>
-            </w:pPr>
-            <w:r>
-              <w:rPr>
-                <w:sz w:val="18"/>
-                <w:szCs w:val="18"/>
-              </w:rPr>
-              <w:t xml:space="preserve">채널이 바뀌면 결과 초기화, R/G/B면 채널 영상을 만들어 Viewer2에 표시</w:t>
+            <w:tcW w:type="dxa" w:w="5841"/>
+            <w:tcBorders>
+              <w:top w:val="single" w:color="BFBFBF" w:sz="4"/>
+              <w:left w:val="single" w:color="BFBFBF" w:sz="4"/>
+              <w:bottom w:val="single" w:color="BFBFBF" w:sz="4"/>
+              <w:right w:val="single" w:color="BFBFBF" w:sz="4"/>
+            </w:tcBorders>
+            <w:tcMar>
+              <w:top w:type="dxa" w:w="60"/>
+              <w:left w:type="dxa" w:w="100"/>
+              <w:bottom w:type="dxa" w:w="60"/>
+              <w:right w:type="dxa" w:w="100"/>
+            </w:tcMar>
+          </w:tcPr>
+          <w:p>
+            <w:pPr>
+              <w:spacing w:after="0" w:before="0"/>
+            </w:pPr>
+            <w:r>
+              <w:rPr>
+                <w:sz w:val="18"/>
+                <w:szCs w:val="18"/>
+              </w:rPr>
+              <w:t xml:space="preserve">256개 막대를 Canvas에 그림</w:t>
             </w:r>
           </w:p>
         </w:tc>
@@ -11914,7 +12060,7 @@
         </w:trPr>
         <w:tc>
           <w:tcPr>
-            <w:tcW w:type="dxa" w:w="2519"/>
+            <w:tcW w:type="dxa" w:w="2239"/>
             <w:tcBorders>
               <w:top w:val="single" w:color="BFBFBF" w:sz="4"/>
               <w:left w:val="single" w:color="BFBFBF" w:sz="4"/>
@@ -11940,65 +12086,65 @@
                 <w:szCs w:val="18"/>
                 <w:shd w:fill="F2F2F2" w:color="auto" w:val="clear"/>
               </w:rPr>
-              <w:t xml:space="preserve">OnProcessingCompleted</w:t>
-            </w:r>
-          </w:p>
-        </w:tc>
-        <w:tc>
-          <w:tcPr>
-            <w:tcW w:type="dxa" w:w="1752"/>
-            <w:tcBorders>
-              <w:top w:val="single" w:color="BFBFBF" w:sz="4"/>
-              <w:left w:val="single" w:color="BFBFBF" w:sz="4"/>
-              <w:bottom w:val="single" w:color="BFBFBF" w:sz="4"/>
-              <w:right w:val="single" w:color="BFBFBF" w:sz="4"/>
-            </w:tcBorders>
-            <w:tcMar>
-              <w:top w:type="dxa" w:w="60"/>
-              <w:left w:type="dxa" w:w="100"/>
-              <w:bottom w:type="dxa" w:w="60"/>
-              <w:right w:type="dxa" w:w="100"/>
-            </w:tcMar>
-          </w:tcPr>
-          <w:p>
-            <w:pPr>
-              <w:spacing w:after="0" w:before="0"/>
-            </w:pPr>
-            <w:r>
-              <w:rPr>
-                <w:sz w:val="18"/>
-                <w:szCs w:val="18"/>
-              </w:rPr>
-              <w:t xml:space="preserve">Processing.cs</w:t>
-            </w:r>
-          </w:p>
-        </w:tc>
-        <w:tc>
-          <w:tcPr>
-            <w:tcW w:type="dxa" w:w="5367"/>
-            <w:tcBorders>
-              <w:top w:val="single" w:color="BFBFBF" w:sz="4"/>
-              <w:left w:val="single" w:color="BFBFBF" w:sz="4"/>
-              <w:bottom w:val="single" w:color="BFBFBF" w:sz="4"/>
-              <w:right w:val="single" w:color="BFBFBF" w:sz="4"/>
-            </w:tcBorders>
-            <w:tcMar>
-              <w:top w:type="dxa" w:w="60"/>
-              <w:left w:type="dxa" w:w="100"/>
-              <w:bottom w:type="dxa" w:w="60"/>
-              <w:right w:type="dxa" w:w="100"/>
-            </w:tcMar>
-          </w:tcPr>
-          <w:p>
-            <w:pPr>
-              <w:spacing w:after="0" w:before="0"/>
-            </w:pPr>
-            <w:r>
-              <w:rPr>
-                <w:sz w:val="18"/>
-                <w:szCs w:val="18"/>
-              </w:rPr>
-              <w:t xml:space="preserve">처리 후 Viewer2·처리시간·히스토그램 갱신</w:t>
+              <w:t xml:space="preserve">ApplySelectedChannel</w:t>
+            </w:r>
+          </w:p>
+        </w:tc>
+        <w:tc>
+          <w:tcPr>
+            <w:tcW w:type="dxa" w:w="1558"/>
+            <w:tcBorders>
+              <w:top w:val="single" w:color="BFBFBF" w:sz="4"/>
+              <w:left w:val="single" w:color="BFBFBF" w:sz="4"/>
+              <w:bottom w:val="single" w:color="BFBFBF" w:sz="4"/>
+              <w:right w:val="single" w:color="BFBFBF" w:sz="4"/>
+            </w:tcBorders>
+            <w:tcMar>
+              <w:top w:type="dxa" w:w="60"/>
+              <w:left w:type="dxa" w:w="100"/>
+              <w:bottom w:type="dxa" w:w="60"/>
+              <w:right w:type="dxa" w:w="100"/>
+            </w:tcMar>
+          </w:tcPr>
+          <w:p>
+            <w:pPr>
+              <w:spacing w:after="0" w:before="0"/>
+            </w:pPr>
+            <w:r>
+              <w:rPr>
+                <w:sz w:val="18"/>
+                <w:szCs w:val="18"/>
+              </w:rPr>
+              <w:t xml:space="preserve">Histogram.cs</w:t>
+            </w:r>
+          </w:p>
+        </w:tc>
+        <w:tc>
+          <w:tcPr>
+            <w:tcW w:type="dxa" w:w="5841"/>
+            <w:tcBorders>
+              <w:top w:val="single" w:color="BFBFBF" w:sz="4"/>
+              <w:left w:val="single" w:color="BFBFBF" w:sz="4"/>
+              <w:bottom w:val="single" w:color="BFBFBF" w:sz="4"/>
+              <w:right w:val="single" w:color="BFBFBF" w:sz="4"/>
+            </w:tcBorders>
+            <w:tcMar>
+              <w:top w:type="dxa" w:w="60"/>
+              <w:left w:type="dxa" w:w="100"/>
+              <w:bottom w:type="dxa" w:w="60"/>
+              <w:right w:type="dxa" w:w="100"/>
+            </w:tcMar>
+          </w:tcPr>
+          <w:p>
+            <w:pPr>
+              <w:spacing w:after="0" w:before="0"/>
+            </w:pPr>
+            <w:r>
+              <w:rPr>
+                <w:sz w:val="18"/>
+                <w:szCs w:val="18"/>
+              </w:rPr>
+              <w:t xml:space="preserve">채널이 바뀌면 결과 초기화, R/G/B면 채널 영상을 만들어 Viewer2에 표시</w:t>
             </w:r>
           </w:p>
         </w:tc>
@@ -12009,7 +12155,7 @@
         </w:trPr>
         <w:tc>
           <w:tcPr>
-            <w:tcW w:type="dxa" w:w="2519"/>
+            <w:tcW w:type="dxa" w:w="2239"/>
             <w:tcBorders>
               <w:top w:val="single" w:color="BFBFBF" w:sz="4"/>
               <w:left w:val="single" w:color="BFBFBF" w:sz="4"/>
@@ -12035,13 +12181,108 @@
                 <w:szCs w:val="18"/>
                 <w:shd w:fill="F2F2F2" w:color="auto" w:val="clear"/>
               </w:rPr>
+              <w:t xml:space="preserve">OnProcessingCompleted</w:t>
+            </w:r>
+          </w:p>
+        </w:tc>
+        <w:tc>
+          <w:tcPr>
+            <w:tcW w:type="dxa" w:w="1558"/>
+            <w:tcBorders>
+              <w:top w:val="single" w:color="BFBFBF" w:sz="4"/>
+              <w:left w:val="single" w:color="BFBFBF" w:sz="4"/>
+              <w:bottom w:val="single" w:color="BFBFBF" w:sz="4"/>
+              <w:right w:val="single" w:color="BFBFBF" w:sz="4"/>
+            </w:tcBorders>
+            <w:tcMar>
+              <w:top w:type="dxa" w:w="60"/>
+              <w:left w:type="dxa" w:w="100"/>
+              <w:bottom w:type="dxa" w:w="60"/>
+              <w:right w:type="dxa" w:w="100"/>
+            </w:tcMar>
+          </w:tcPr>
+          <w:p>
+            <w:pPr>
+              <w:spacing w:after="0" w:before="0"/>
+            </w:pPr>
+            <w:r>
+              <w:rPr>
+                <w:sz w:val="18"/>
+                <w:szCs w:val="18"/>
+              </w:rPr>
+              <w:t xml:space="preserve">Processing.cs</w:t>
+            </w:r>
+          </w:p>
+        </w:tc>
+        <w:tc>
+          <w:tcPr>
+            <w:tcW w:type="dxa" w:w="5841"/>
+            <w:tcBorders>
+              <w:top w:val="single" w:color="BFBFBF" w:sz="4"/>
+              <w:left w:val="single" w:color="BFBFBF" w:sz="4"/>
+              <w:bottom w:val="single" w:color="BFBFBF" w:sz="4"/>
+              <w:right w:val="single" w:color="BFBFBF" w:sz="4"/>
+            </w:tcBorders>
+            <w:tcMar>
+              <w:top w:type="dxa" w:w="60"/>
+              <w:left w:type="dxa" w:w="100"/>
+              <w:bottom w:type="dxa" w:w="60"/>
+              <w:right w:type="dxa" w:w="100"/>
+            </w:tcMar>
+          </w:tcPr>
+          <w:p>
+            <w:pPr>
+              <w:spacing w:after="0" w:before="0"/>
+            </w:pPr>
+            <w:r>
+              <w:rPr>
+                <w:sz w:val="18"/>
+                <w:szCs w:val="18"/>
+              </w:rPr>
+              <w:t xml:space="preserve">처리 후 Viewer2·처리시간·히스토그램 갱신</w:t>
+            </w:r>
+          </w:p>
+        </w:tc>
+      </w:tr>
+      <w:tr>
+        <w:trPr>
+          <w:tblHeader w:val="off"/>
+        </w:trPr>
+        <w:tc>
+          <w:tcPr>
+            <w:tcW w:type="dxa" w:w="2239"/>
+            <w:tcBorders>
+              <w:top w:val="single" w:color="BFBFBF" w:sz="4"/>
+              <w:left w:val="single" w:color="BFBFBF" w:sz="4"/>
+              <w:bottom w:val="single" w:color="BFBFBF" w:sz="4"/>
+              <w:right w:val="single" w:color="BFBFBF" w:sz="4"/>
+            </w:tcBorders>
+            <w:tcMar>
+              <w:top w:type="dxa" w:w="60"/>
+              <w:left w:type="dxa" w:w="100"/>
+              <w:bottom w:type="dxa" w:w="60"/>
+              <w:right w:type="dxa" w:w="100"/>
+            </w:tcMar>
+          </w:tcPr>
+          <w:p>
+            <w:pPr>
+              <w:spacing w:after="0" w:before="0"/>
+            </w:pPr>
+            <w:r>
+              <w:rPr>
+                <w:rFonts w:ascii="Consolas" w:eastAsia="맑은 고딕" w:hAnsi="Consolas"/>
+                <w:color w:val="A31515"/>
+                <w:sz w:val="18"/>
+                <w:szCs w:val="18"/>
+                <w:shd w:fill="F2F2F2" w:color="auto" w:val="clear"/>
+              </w:rPr>
               <w:t xml:space="preserve">CanRunTemplateMatching</w:t>
             </w:r>
           </w:p>
         </w:tc>
         <w:tc>
           <w:tcPr>
-            <w:tcW w:type="dxa" w:w="1752"/>
+            <w:tcW w:type="dxa" w:w="1558"/>
             <w:tcBorders>
               <w:top w:val="single" w:color="BFBFBF" w:sz="4"/>
               <w:left w:val="single" w:color="BFBFBF" w:sz="4"/>
@@ -12070,7 +12311,7 @@
         </w:tc>
         <w:tc>
           <w:tcPr>
-            <w:tcW w:type="dxa" w:w="5367"/>
+            <w:tcW w:type="dxa" w:w="5841"/>
             <w:tcBorders>
               <w:top w:val="single" w:color="BFBFBF" w:sz="4"/>
               <w:left w:val="single" w:color="BFBFBF" w:sz="4"/>
@@ -14965,6 +15206,587 @@
           <w:szCs w:val="17"/>
         </w:rPr>
         <w:t xml:space="preserve">이후 처리 버튼을 누르면 GetWorkingBitmap 이 ChannelBitmap 을 돌려줘서 채널 영상이 처리된다.</w:t>
+      </w:r>
+    </w:p>
+    <w:p>
+      <w:pPr>
+        <w:pStyle w:val="Heading2"/>
+      </w:pPr>
+      <w:r>
+        <w:t xml:space="preserve">ROI 사각형과 템플릿 매칭 사각형의 차이</w:t>
+      </w:r>
+    </w:p>
+    <w:tbl>
+      <w:tblPr>
+        <w:tblW w:type="dxa" w:w="9638"/>
+        <w:tblBorders>
+          <w:top w:val="single" w:color="auto" w:sz="4"/>
+          <w:left w:val="single" w:color="auto" w:sz="4"/>
+          <w:bottom w:val="single" w:color="auto" w:sz="4"/>
+          <w:right w:val="single" w:color="auto" w:sz="4"/>
+          <w:insideH w:val="single" w:color="auto" w:sz="4"/>
+          <w:insideV w:val="single" w:color="auto" w:sz="4"/>
+        </w:tblBorders>
+      </w:tblPr>
+      <w:tblGrid>
+        <w:gridCol w:w="1799"/>
+        <w:gridCol w:w="4369"/>
+        <w:gridCol w:w="3470"/>
+      </w:tblGrid>
+      <w:tr>
+        <w:trPr>
+          <w:tblHeader/>
+        </w:trPr>
+        <w:tc>
+          <w:tcPr>
+            <w:tcW w:type="dxa" w:w="1799"/>
+            <w:tcBorders>
+              <w:top w:val="single" w:color="BFBFBF" w:sz="4"/>
+              <w:left w:val="single" w:color="BFBFBF" w:sz="4"/>
+              <w:bottom w:val="single" w:color="BFBFBF" w:sz="4"/>
+              <w:right w:val="single" w:color="BFBFBF" w:sz="4"/>
+            </w:tcBorders>
+            <w:shd w:fill="DEEAF6" w:color="auto" w:val="clear"/>
+            <w:tcMar>
+              <w:top w:type="dxa" w:w="60"/>
+              <w:left w:type="dxa" w:w="100"/>
+              <w:bottom w:type="dxa" w:w="60"/>
+              <w:right w:type="dxa" w:w="100"/>
+            </w:tcMar>
+          </w:tcPr>
+          <w:p>
+            <w:pPr>
+              <w:spacing w:after="0" w:before="0"/>
+            </w:pPr>
+          </w:p>
+        </w:tc>
+        <w:tc>
+          <w:tcPr>
+            <w:tcW w:type="dxa" w:w="4369"/>
+            <w:tcBorders>
+              <w:top w:val="single" w:color="BFBFBF" w:sz="4"/>
+              <w:left w:val="single" w:color="BFBFBF" w:sz="4"/>
+              <w:bottom w:val="single" w:color="BFBFBF" w:sz="4"/>
+              <w:right w:val="single" w:color="BFBFBF" w:sz="4"/>
+            </w:tcBorders>
+            <w:shd w:fill="DEEAF6" w:color="auto" w:val="clear"/>
+            <w:tcMar>
+              <w:top w:type="dxa" w:w="60"/>
+              <w:left w:type="dxa" w:w="100"/>
+              <w:bottom w:type="dxa" w:w="60"/>
+              <w:right w:type="dxa" w:w="100"/>
+            </w:tcMar>
+          </w:tcPr>
+          <w:p>
+            <w:pPr>
+              <w:spacing w:after="0" w:before="0"/>
+            </w:pPr>
+            <w:r>
+              <w:rPr>
+                <w:b/>
+                <w:bCs/>
+                <w:sz w:val="18"/>
+                <w:szCs w:val="18"/>
+              </w:rPr>
+              <w:t xml:space="preserve">ROI 사각형</w:t>
+            </w:r>
+          </w:p>
+        </w:tc>
+        <w:tc>
+          <w:tcPr>
+            <w:tcW w:type="dxa" w:w="3470"/>
+            <w:tcBorders>
+              <w:top w:val="single" w:color="BFBFBF" w:sz="4"/>
+              <w:left w:val="single" w:color="BFBFBF" w:sz="4"/>
+              <w:bottom w:val="single" w:color="BFBFBF" w:sz="4"/>
+              <w:right w:val="single" w:color="BFBFBF" w:sz="4"/>
+            </w:tcBorders>
+            <w:shd w:fill="DEEAF6" w:color="auto" w:val="clear"/>
+            <w:tcMar>
+              <w:top w:type="dxa" w:w="60"/>
+              <w:left w:type="dxa" w:w="100"/>
+              <w:bottom w:type="dxa" w:w="60"/>
+              <w:right w:type="dxa" w:w="100"/>
+            </w:tcMar>
+          </w:tcPr>
+          <w:p>
+            <w:pPr>
+              <w:spacing w:after="0" w:before="0"/>
+            </w:pPr>
+            <w:r>
+              <w:rPr>
+                <w:b/>
+                <w:bCs/>
+                <w:sz w:val="18"/>
+                <w:szCs w:val="18"/>
+              </w:rPr>
+              <w:t xml:space="preserve">템플릿 매칭 사각형</w:t>
+            </w:r>
+          </w:p>
+        </w:tc>
+      </w:tr>
+      <w:tr>
+        <w:trPr>
+          <w:tblHeader w:val="off"/>
+        </w:trPr>
+        <w:tc>
+          <w:tcPr>
+            <w:tcW w:type="dxa" w:w="1799"/>
+            <w:tcBorders>
+              <w:top w:val="single" w:color="BFBFBF" w:sz="4"/>
+              <w:left w:val="single" w:color="BFBFBF" w:sz="4"/>
+              <w:bottom w:val="single" w:color="BFBFBF" w:sz="4"/>
+              <w:right w:val="single" w:color="BFBFBF" w:sz="4"/>
+            </w:tcBorders>
+            <w:tcMar>
+              <w:top w:type="dxa" w:w="60"/>
+              <w:left w:type="dxa" w:w="100"/>
+              <w:bottom w:type="dxa" w:w="60"/>
+              <w:right w:type="dxa" w:w="100"/>
+            </w:tcMar>
+          </w:tcPr>
+          <w:p>
+            <w:pPr>
+              <w:spacing w:after="0" w:before="0"/>
+            </w:pPr>
+            <w:r>
+              <w:rPr>
+                <w:sz w:val="18"/>
+                <w:szCs w:val="18"/>
+              </w:rPr>
+              <w:t xml:space="preserve">정체</w:t>
+            </w:r>
+          </w:p>
+        </w:tc>
+        <w:tc>
+          <w:tcPr>
+            <w:tcW w:type="dxa" w:w="4369"/>
+            <w:tcBorders>
+              <w:top w:val="single" w:color="BFBFBF" w:sz="4"/>
+              <w:left w:val="single" w:color="BFBFBF" w:sz="4"/>
+              <w:bottom w:val="single" w:color="BFBFBF" w:sz="4"/>
+              <w:right w:val="single" w:color="BFBFBF" w:sz="4"/>
+            </w:tcBorders>
+            <w:tcMar>
+              <w:top w:type="dxa" w:w="60"/>
+              <w:left w:type="dxa" w:w="100"/>
+              <w:bottom w:type="dxa" w:w="60"/>
+              <w:right w:type="dxa" w:w="100"/>
+            </w:tcMar>
+          </w:tcPr>
+          <w:p>
+            <w:pPr>
+              <w:spacing w:after="0" w:before="0"/>
+            </w:pPr>
+            <w:r>
+              <w:rPr>
+                <w:sz w:val="18"/>
+                <w:szCs w:val="18"/>
+              </w:rPr>
+              <w:t xml:space="preserve">영상 위에 겹쳐 놓은 WPF </w:t>
+            </w:r>
+            <w:r>
+              <w:rPr>
+                <w:rFonts w:ascii="Consolas" w:eastAsia="맑은 고딕" w:hAnsi="Consolas"/>
+                <w:color w:val="A31515"/>
+                <w:sz w:val="18"/>
+                <w:szCs w:val="18"/>
+                <w:shd w:fill="F2F2F2" w:color="auto" w:val="clear"/>
+              </w:rPr>
+              <w:t xml:space="preserve">Rectangle</w:t>
+            </w:r>
+            <w:r>
+              <w:rPr>
+                <w:sz w:val="18"/>
+                <w:szCs w:val="18"/>
+              </w:rPr>
+              <w:t xml:space="preserve"> (픽셀이 아님)</w:t>
+            </w:r>
+          </w:p>
+        </w:tc>
+        <w:tc>
+          <w:tcPr>
+            <w:tcW w:type="dxa" w:w="3470"/>
+            <w:tcBorders>
+              <w:top w:val="single" w:color="BFBFBF" w:sz="4"/>
+              <w:left w:val="single" w:color="BFBFBF" w:sz="4"/>
+              <w:bottom w:val="single" w:color="BFBFBF" w:sz="4"/>
+              <w:right w:val="single" w:color="BFBFBF" w:sz="4"/>
+            </w:tcBorders>
+            <w:tcMar>
+              <w:top w:type="dxa" w:w="60"/>
+              <w:left w:type="dxa" w:w="100"/>
+              <w:bottom w:type="dxa" w:w="60"/>
+              <w:right w:type="dxa" w:w="100"/>
+            </w:tcMar>
+          </w:tcPr>
+          <w:p>
+            <w:pPr>
+              <w:spacing w:after="0" w:before="0"/>
+            </w:pPr>
+            <w:r>
+              <w:rPr>
+                <w:sz w:val="18"/>
+                <w:szCs w:val="18"/>
+              </w:rPr>
+              <w:t xml:space="preserve">결과 영상 </w:t>
+            </w:r>
+            <w:r>
+              <w:rPr>
+                <w:b/>
+                <w:bCs/>
+                <w:sz w:val="18"/>
+                <w:szCs w:val="18"/>
+              </w:rPr>
+              <w:t xml:space="preserve">픽셀에 직접</w:t>
+            </w:r>
+            <w:r>
+              <w:rPr>
+                <w:sz w:val="18"/>
+                <w:szCs w:val="18"/>
+              </w:rPr>
+              <w:t xml:space="preserve"> 그린 빨간 선</w:t>
+            </w:r>
+          </w:p>
+        </w:tc>
+      </w:tr>
+      <w:tr>
+        <w:trPr>
+          <w:tblHeader w:val="off"/>
+        </w:trPr>
+        <w:tc>
+          <w:tcPr>
+            <w:tcW w:type="dxa" w:w="1799"/>
+            <w:tcBorders>
+              <w:top w:val="single" w:color="BFBFBF" w:sz="4"/>
+              <w:left w:val="single" w:color="BFBFBF" w:sz="4"/>
+              <w:bottom w:val="single" w:color="BFBFBF" w:sz="4"/>
+              <w:right w:val="single" w:color="BFBFBF" w:sz="4"/>
+            </w:tcBorders>
+            <w:tcMar>
+              <w:top w:type="dxa" w:w="60"/>
+              <w:left w:type="dxa" w:w="100"/>
+              <w:bottom w:type="dxa" w:w="60"/>
+              <w:right w:type="dxa" w:w="100"/>
+            </w:tcMar>
+          </w:tcPr>
+          <w:p>
+            <w:pPr>
+              <w:spacing w:after="0" w:before="0"/>
+            </w:pPr>
+            <w:r>
+              <w:rPr>
+                <w:sz w:val="18"/>
+                <w:szCs w:val="18"/>
+              </w:rPr>
+              <w:t xml:space="preserve">표시 위치</w:t>
+            </w:r>
+          </w:p>
+        </w:tc>
+        <w:tc>
+          <w:tcPr>
+            <w:tcW w:type="dxa" w:w="4369"/>
+            <w:tcBorders>
+              <w:top w:val="single" w:color="BFBFBF" w:sz="4"/>
+              <w:left w:val="single" w:color="BFBFBF" w:sz="4"/>
+              <w:bottom w:val="single" w:color="BFBFBF" w:sz="4"/>
+              <w:right w:val="single" w:color="BFBFBF" w:sz="4"/>
+            </w:tcBorders>
+            <w:tcMar>
+              <w:top w:type="dxa" w:w="60"/>
+              <w:left w:type="dxa" w:w="100"/>
+              <w:bottom w:type="dxa" w:w="60"/>
+              <w:right w:type="dxa" w:w="100"/>
+            </w:tcMar>
+          </w:tcPr>
+          <w:p>
+            <w:pPr>
+              <w:spacing w:after="0" w:before="0"/>
+            </w:pPr>
+            <w:r>
+              <w:rPr>
+                <w:sz w:val="18"/>
+                <w:szCs w:val="18"/>
+              </w:rPr>
+              <w:t xml:space="preserve">Viewer1, Viewer2, Navigator</w:t>
+            </w:r>
+          </w:p>
+        </w:tc>
+        <w:tc>
+          <w:tcPr>
+            <w:tcW w:type="dxa" w:w="3470"/>
+            <w:tcBorders>
+              <w:top w:val="single" w:color="BFBFBF" w:sz="4"/>
+              <w:left w:val="single" w:color="BFBFBF" w:sz="4"/>
+              <w:bottom w:val="single" w:color="BFBFBF" w:sz="4"/>
+              <w:right w:val="single" w:color="BFBFBF" w:sz="4"/>
+            </w:tcBorders>
+            <w:tcMar>
+              <w:top w:type="dxa" w:w="60"/>
+              <w:left w:type="dxa" w:w="100"/>
+              <w:bottom w:type="dxa" w:w="60"/>
+              <w:right w:type="dxa" w:w="100"/>
+            </w:tcMar>
+          </w:tcPr>
+          <w:p>
+            <w:pPr>
+              <w:spacing w:after="0" w:before="0"/>
+            </w:pPr>
+            <w:r>
+              <w:rPr>
+                <w:sz w:val="18"/>
+                <w:szCs w:val="18"/>
+              </w:rPr>
+              <w:t xml:space="preserve">Viewer2</w:t>
+            </w:r>
+          </w:p>
+        </w:tc>
+      </w:tr>
+      <w:tr>
+        <w:trPr>
+          <w:tblHeader w:val="off"/>
+        </w:trPr>
+        <w:tc>
+          <w:tcPr>
+            <w:tcW w:type="dxa" w:w="1799"/>
+            <w:tcBorders>
+              <w:top w:val="single" w:color="BFBFBF" w:sz="4"/>
+              <w:left w:val="single" w:color="BFBFBF" w:sz="4"/>
+              <w:bottom w:val="single" w:color="BFBFBF" w:sz="4"/>
+              <w:right w:val="single" w:color="BFBFBF" w:sz="4"/>
+            </w:tcBorders>
+            <w:tcMar>
+              <w:top w:type="dxa" w:w="60"/>
+              <w:left w:type="dxa" w:w="100"/>
+              <w:bottom w:type="dxa" w:w="60"/>
+              <w:right w:type="dxa" w:w="100"/>
+            </w:tcMar>
+          </w:tcPr>
+          <w:p>
+            <w:pPr>
+              <w:spacing w:after="0" w:before="0"/>
+            </w:pPr>
+            <w:r>
+              <w:rPr>
+                <w:sz w:val="18"/>
+                <w:szCs w:val="18"/>
+              </w:rPr>
+              <w:t xml:space="preserve">사라지는 때</w:t>
+            </w:r>
+          </w:p>
+        </w:tc>
+        <w:tc>
+          <w:tcPr>
+            <w:tcW w:type="dxa" w:w="4369"/>
+            <w:tcBorders>
+              <w:top w:val="single" w:color="BFBFBF" w:sz="4"/>
+              <w:left w:val="single" w:color="BFBFBF" w:sz="4"/>
+              <w:bottom w:val="single" w:color="BFBFBF" w:sz="4"/>
+              <w:right w:val="single" w:color="BFBFBF" w:sz="4"/>
+            </w:tcBorders>
+            <w:tcMar>
+              <w:top w:type="dxa" w:w="60"/>
+              <w:left w:type="dxa" w:w="100"/>
+              <w:bottom w:type="dxa" w:w="60"/>
+              <w:right w:type="dxa" w:w="100"/>
+            </w:tcMar>
+          </w:tcPr>
+          <w:p>
+            <w:pPr>
+              <w:spacing w:after="0" w:before="0"/>
+            </w:pPr>
+            <w:r>
+              <w:rPr>
+                <w:sz w:val="18"/>
+                <w:szCs w:val="18"/>
+              </w:rPr>
+              <w:t xml:space="preserve">ROI 취소, 빈 드래그, 새 이미지 열기</w:t>
+            </w:r>
+          </w:p>
+        </w:tc>
+        <w:tc>
+          <w:tcPr>
+            <w:tcW w:type="dxa" w:w="3470"/>
+            <w:tcBorders>
+              <w:top w:val="single" w:color="BFBFBF" w:sz="4"/>
+              <w:left w:val="single" w:color="BFBFBF" w:sz="4"/>
+              <w:bottom w:val="single" w:color="BFBFBF" w:sz="4"/>
+              <w:right w:val="single" w:color="BFBFBF" w:sz="4"/>
+            </w:tcBorders>
+            <w:tcMar>
+              <w:top w:type="dxa" w:w="60"/>
+              <w:left w:type="dxa" w:w="100"/>
+              <w:bottom w:type="dxa" w:w="60"/>
+              <w:right w:type="dxa" w:w="100"/>
+            </w:tcMar>
+          </w:tcPr>
+          <w:p>
+            <w:pPr>
+              <w:spacing w:after="0" w:before="0"/>
+            </w:pPr>
+            <w:r>
+              <w:rPr>
+                <w:sz w:val="18"/>
+                <w:szCs w:val="18"/>
+              </w:rPr>
+              <w:t xml:space="preserve">다른 처리를 실행할 때</w:t>
+            </w:r>
+          </w:p>
+        </w:tc>
+      </w:tr>
+      <w:tr>
+        <w:trPr>
+          <w:tblHeader w:val="off"/>
+        </w:trPr>
+        <w:tc>
+          <w:tcPr>
+            <w:tcW w:type="dxa" w:w="1799"/>
+            <w:tcBorders>
+              <w:top w:val="single" w:color="BFBFBF" w:sz="4"/>
+              <w:left w:val="single" w:color="BFBFBF" w:sz="4"/>
+              <w:bottom w:val="single" w:color="BFBFBF" w:sz="4"/>
+              <w:right w:val="single" w:color="BFBFBF" w:sz="4"/>
+            </w:tcBorders>
+            <w:tcMar>
+              <w:top w:type="dxa" w:w="60"/>
+              <w:left w:type="dxa" w:w="100"/>
+              <w:bottom w:type="dxa" w:w="60"/>
+              <w:right w:type="dxa" w:w="100"/>
+            </w:tcMar>
+          </w:tcPr>
+          <w:p>
+            <w:pPr>
+              <w:spacing w:after="0" w:before="0"/>
+            </w:pPr>
+            <w:r>
+              <w:rPr>
+                <w:sz w:val="18"/>
+                <w:szCs w:val="18"/>
+              </w:rPr>
+              <w:t xml:space="preserve">다음 처리 입력에 섞이나?</w:t>
+            </w:r>
+          </w:p>
+        </w:tc>
+        <w:tc>
+          <w:tcPr>
+            <w:tcW w:type="dxa" w:w="4369"/>
+            <w:tcBorders>
+              <w:top w:val="single" w:color="BFBFBF" w:sz="4"/>
+              <w:left w:val="single" w:color="BFBFBF" w:sz="4"/>
+              <w:bottom w:val="single" w:color="BFBFBF" w:sz="4"/>
+              <w:right w:val="single" w:color="BFBFBF" w:sz="4"/>
+            </w:tcBorders>
+            <w:tcMar>
+              <w:top w:type="dxa" w:w="60"/>
+              <w:left w:type="dxa" w:w="100"/>
+              <w:bottom w:type="dxa" w:w="60"/>
+              <w:right w:type="dxa" w:w="100"/>
+            </w:tcMar>
+          </w:tcPr>
+          <w:p>
+            <w:pPr>
+              <w:spacing w:after="0" w:before="0"/>
+            </w:pPr>
+            <w:r>
+              <w:rPr>
+                <w:sz w:val="18"/>
+                <w:szCs w:val="18"/>
+              </w:rPr>
+              <w:t xml:space="preserve">아니오 (픽셀이 아니므로)</w:t>
+            </w:r>
+          </w:p>
+        </w:tc>
+        <w:tc>
+          <w:tcPr>
+            <w:tcW w:type="dxa" w:w="3470"/>
+            <w:tcBorders>
+              <w:top w:val="single" w:color="BFBFBF" w:sz="4"/>
+              <w:left w:val="single" w:color="BFBFBF" w:sz="4"/>
+              <w:bottom w:val="single" w:color="BFBFBF" w:sz="4"/>
+              <w:right w:val="single" w:color="BFBFBF" w:sz="4"/>
+            </w:tcBorders>
+            <w:tcMar>
+              <w:top w:type="dxa" w:w="60"/>
+              <w:left w:type="dxa" w:w="100"/>
+              <w:bottom w:type="dxa" w:w="60"/>
+              <w:right w:type="dxa" w:w="100"/>
+            </w:tcMar>
+          </w:tcPr>
+          <w:p>
+            <w:pPr>
+              <w:spacing w:after="0" w:before="0"/>
+            </w:pPr>
+            <w:r>
+              <w:rPr>
+                <w:sz w:val="18"/>
+                <w:szCs w:val="18"/>
+              </w:rPr>
+              <w:t xml:space="preserve">아니오 (</w:t>
+            </w:r>
+            <w:r>
+              <w:rPr>
+                <w:rFonts w:ascii="Consolas" w:eastAsia="맑은 고딕" w:hAnsi="Consolas"/>
+                <w:color w:val="A31515"/>
+                <w:sz w:val="18"/>
+                <w:szCs w:val="18"/>
+                <w:shd w:fill="F2F2F2" w:color="auto" w:val="clear"/>
+              </w:rPr>
+              <w:t xml:space="preserve">resultWithoutBox</w:t>
+            </w:r>
+            <w:r>
+              <w:rPr>
+                <w:sz w:val="18"/>
+                <w:szCs w:val="18"/>
+              </w:rPr>
+              <w:t xml:space="preserve"> 로 막음)</w:t>
+            </w:r>
+          </w:p>
+        </w:tc>
+      </w:tr>
+    </w:tbl>
+    <w:p>
+      <w:pPr>
+        <w:spacing w:after="80"/>
+      </w:pPr>
+    </w:p>
+    <w:p>
+      <w:pPr>
+        <w:spacing w:after="120"/>
+      </w:pPr>
+      <w:r>
+        <w:t xml:space="preserve">히스토그램 위의 "대상 : 원본 / 처리 결과" 는 </w:t>
+      </w:r>
+      <w:r>
+        <w:rPr>
+          <w:b/>
+          <w:bCs/>
+        </w:rPr>
+        <w:t xml:space="preserve">어떤 영상</w:t>
+      </w:r>
+      <w:r>
+        <w:t xml:space="preserve">을 셀지,</w:t>
+      </w:r>
+      <w:r>
+        <w:br/>
+      </w:r>
+      <w:r>
+        <w:t xml:space="preserve">"범위 : 전체 영역 / ROI 영역" 은 그 영상의 </w:t>
+      </w:r>
+      <w:r>
+        <w:rPr>
+          <w:b/>
+          <w:bCs/>
+        </w:rPr>
+        <w:t xml:space="preserve">어느 부분</w:t>
+      </w:r>
+      <w:r>
+        <w:t xml:space="preserve">을 셀지를 뜻한다.</w:t>
+      </w:r>
+      <w:r>
+        <w:br/>
+      </w:r>
+      <w:r>
+        <w:t xml:space="preserve">ROI가 있으면 Viewer2에도 같은 사각형이 그려지므로, 처리 결과의 어느 부분을 센 것인지 바로 보인다.</w:t>
       </w:r>
     </w:p>
     <w:p>

</xml_diff>

<commit_message>
Use one pixel index formula (y * stride + x * 3 + c) for temp buffers
Allocate the horizontal-pass tmp buffers in Dilation, Erosion and Gaussian
with the same stride as src/dst so every buffer is indexed the same way.
Results are unchanged (verified against the previous indexing for widths
1, 5, 7, 8, 13, 64). Update guide.

Co-Authored-By: Claude Opus 5.5 <noreply@anthropic.com>
Claude-Session: https://claude.ai/code/session_019qMwoX24MJmDBfNA6HFSJ8
</commit_message>
<xml_diff>
--- a/docs/REFACTORING_GUIDE.docx
+++ b/docs/REFACTORING_GUIDE.docx
@@ -1132,7 +1132,13 @@
         <w:t xml:space="preserve">다른 위치를 읽거나 배열 밖을 읽게 됨</w:t>
       </w:r>
       <w:r>
-        <w:t xml:space="preserve"> → </w:t>
+        <w:t xml:space="preserve">.</w:t>
+      </w:r>
+      <w:r>
+        <w:br/>
+      </w:r>
+      <w:r>
+        <w:t xml:space="preserve">→ tmp를 </w:t>
       </w:r>
       <w:r>
         <w:rPr>
@@ -1140,10 +1146,27 @@
           <w:color w:val="A31515"/>
           <w:shd w:fill="F2F2F2" w:color="auto" w:val="clear"/>
         </w:rPr>
-        <w:t xml:space="preserve">(ny * width + x) * 3 + c</w:t>
-      </w:r>
-      <w:r>
-        <w:t xml:space="preserve"> 로 수정.</w:t>
+        <w:t xml:space="preserve">stride * height</w:t>
+      </w:r>
+      <w:r>
+        <w:t xml:space="preserve"> 크기로 만들고 쓰기/읽기 모두 </w:t>
+      </w:r>
+      <w:r>
+        <w:rPr>
+          <w:rFonts w:ascii="Consolas" w:eastAsia="맑은 고딕" w:hAnsi="Consolas"/>
+          <w:color w:val="A31515"/>
+          <w:shd w:fill="F2F2F2" w:color="auto" w:val="clear"/>
+        </w:rPr>
+        <w:t xml:space="preserve">y * stride + x * 3 + c</w:t>
+      </w:r>
+      <w:r>
+        <w:t xml:space="preserve"> 로 통일해서 수정.</w:t>
+      </w:r>
+      <w:r>
+        <w:br/>
+      </w:r>
+      <w:r>
+        <w:t xml:space="preserve">(가우시안의 tmp도 같은 방식으로 통일. 계산 결과는 이전과 동일)</w:t>
       </w:r>
       <w:r>
         <w:br/>
@@ -17042,6 +17065,173 @@
       </w:r>
       <w:r>
         <w:t xml:space="preserve">(기존 팽창/수축 버그가 바로 이 stride와 width*3을 섞어 쓴 문제였다.)</w:t>
+      </w:r>
+    </w:p>
+    <w:p>
+      <w:pPr>
+        <w:pStyle w:val="Heading2"/>
+      </w:pPr>
+      <w:r>
+        <w:t xml:space="preserve">위치 공식은 하나로 통일</w:t>
+      </w:r>
+    </w:p>
+    <w:p>
+      <w:pPr>
+        <w:spacing w:after="120"/>
+      </w:pPr>
+      <w:r>
+        <w:t xml:space="preserve">이 프로그램은 픽셀 위치를 **항상 </w:t>
+      </w:r>
+      <w:r>
+        <w:rPr>
+          <w:rFonts w:ascii="Consolas" w:eastAsia="맑은 고딕" w:hAnsi="Consolas"/>
+          <w:color w:val="A31515"/>
+          <w:shd w:fill="F2F2F2" w:color="auto" w:val="clear"/>
+        </w:rPr>
+        <w:t xml:space="preserve">y * stride + x * 3 + c</w:t>
+      </w:r>
+      <w:r>
+        <w:t xml:space="preserve"> 하나로** 계산한다.</w:t>
+      </w:r>
+      <w:r>
+        <w:br/>
+      </w:r>
+      <w:r>
+        <w:t xml:space="preserve">팽창/수축/가우시안에서 중간 결과를 담는 임시 배열 </w:t>
+      </w:r>
+      <w:r>
+        <w:rPr>
+          <w:rFonts w:ascii="Consolas" w:eastAsia="맑은 고딕" w:hAnsi="Consolas"/>
+          <w:color w:val="A31515"/>
+          <w:shd w:fill="F2F2F2" w:color="auto" w:val="clear"/>
+        </w:rPr>
+        <w:t xml:space="preserve">tmp</w:t>
+      </w:r>
+      <w:r>
+        <w:t xml:space="preserve"> 도 </w:t>
+      </w:r>
+      <w:r>
+        <w:rPr>
+          <w:rFonts w:ascii="Consolas" w:eastAsia="맑은 고딕" w:hAnsi="Consolas"/>
+          <w:color w:val="A31515"/>
+          <w:shd w:fill="F2F2F2" w:color="auto" w:val="clear"/>
+        </w:rPr>
+        <w:t xml:space="preserve">stride * height</w:t>
+      </w:r>
+      <w:r>
+        <w:t xml:space="preserve"> 크기로 만들어</w:t>
+      </w:r>
+      <w:r>
+        <w:br/>
+      </w:r>
+      <w:r>
+        <w:t xml:space="preserve">원본(src)·결과(dst)와 </w:t>
+      </w:r>
+      <w:r>
+        <w:rPr>
+          <w:b/>
+          <w:bCs/>
+        </w:rPr>
+        <w:t xml:space="preserve">같은 모양</w:t>
+      </w:r>
+      <w:r>
+        <w:t xml:space="preserve">(줄 끝 여백 포함)을 갖게 했다.</w:t>
+      </w:r>
+    </w:p>
+    <w:p>
+      <w:pPr>
+        <w:pBdr>
+          <w:left w:val="single" w:color="9DC3E6" w:sz="12" w:space="6"/>
+        </w:pBdr>
+        <w:shd w:fill="F5F5F5" w:color="auto" w:val="clear"/>
+        <w:spacing w:after="0" w:before="80" w:line="260"/>
+        <w:ind w:left="120"/>
+      </w:pPr>
+      <w:r>
+        <w:rPr>
+          <w:rFonts w:ascii="Consolas" w:eastAsia="맑은 고딕" w:hAnsi="Consolas"/>
+          <w:sz w:val="17"/>
+          <w:szCs w:val="17"/>
+        </w:rPr>
+        <w:t xml:space="preserve">std::vector&lt;unsigned char&gt; tmp(stride * height);   // src와 같은 모양</w:t>
+      </w:r>
+    </w:p>
+    <w:p>
+      <w:pPr>
+        <w:pBdr>
+          <w:left w:val="single" w:color="9DC3E6" w:sz="12" w:space="6"/>
+        </w:pBdr>
+        <w:shd w:fill="F5F5F5" w:color="auto" w:val="clear"/>
+        <w:spacing w:after="0" w:before="0" w:line="260"/>
+        <w:ind w:left="120"/>
+      </w:pPr>
+      <w:r>
+        <w:rPr>
+          <w:rFonts w:ascii="Consolas" w:eastAsia="맑은 고딕" w:hAnsi="Consolas"/>
+          <w:sz w:val="17"/>
+          <w:szCs w:val="17"/>
+        </w:rPr>
+        <w:t xml:space="preserve">tmp[y * stride + x * 3 + c] = maxValue;            // 쓰기</w:t>
+      </w:r>
+    </w:p>
+    <w:p>
+      <w:pPr>
+        <w:pBdr>
+          <w:left w:val="single" w:color="9DC3E6" w:sz="12" w:space="6"/>
+        </w:pBdr>
+        <w:shd w:fill="F5F5F5" w:color="auto" w:val="clear"/>
+        <w:spacing w:after="160" w:before="0" w:line="260"/>
+        <w:ind w:left="120"/>
+      </w:pPr>
+      <w:r>
+        <w:rPr>
+          <w:rFonts w:ascii="Consolas" w:eastAsia="맑은 고딕" w:hAnsi="Consolas"/>
+          <w:sz w:val="17"/>
+          <w:szCs w:val="17"/>
+        </w:rPr>
+        <w:t xml:space="preserve">unsigned char value = tmp[ny * stride + x * 3 + c]; // 읽기</w:t>
+      </w:r>
+    </w:p>
+    <w:p>
+      <w:pPr>
+        <w:spacing w:after="120"/>
+      </w:pPr>
+      <w:r>
+        <w:t xml:space="preserve">OpenCV 같은 일반적인 영상처리 라이브러리도 영상마다 시작 주소와 한 줄 크기(</w:t>
+      </w:r>
+      <w:r>
+        <w:rPr>
+          <w:rFonts w:ascii="Consolas" w:eastAsia="맑은 고딕" w:hAnsi="Consolas"/>
+          <w:color w:val="A31515"/>
+          <w:shd w:fill="F2F2F2" w:color="auto" w:val="clear"/>
+        </w:rPr>
+        <w:t xml:space="preserve">step</w:t>
+      </w:r>
+      <w:r>
+        <w:t xml:space="preserve">)를 함께 가지고,</w:t>
+      </w:r>
+      <w:r>
+        <w:br/>
+      </w:r>
+      <w:r>
+        <w:t xml:space="preserve">위치는 항상 </w:t>
+      </w:r>
+      <w:r>
+        <w:rPr>
+          <w:rFonts w:ascii="Consolas" w:eastAsia="맑은 고딕" w:hAnsi="Consolas"/>
+          <w:color w:val="A31515"/>
+          <w:shd w:fill="F2F2F2" w:color="auto" w:val="clear"/>
+        </w:rPr>
+        <w:t xml:space="preserve">y * step + x * 채널수 + c</w:t>
+      </w:r>
+      <w:r>
+        <w:t xml:space="preserve"> 로 계산한다. "공식은 하나, 한 줄 크기는 영상마다" 가 기본 원칙이다.</w:t>
+      </w:r>
+      <w:r>
+        <w:br/>
+      </w:r>
+      <w:r>
+        <w:t xml:space="preserve">줄마다 최대 3칸 정도 메모리가 남지만, 공식이 하나라서 헷갈릴 일이 없다.</w:t>
       </w:r>
     </w:p>
     <w:p>

</xml_diff>

<commit_message>
Draw ROI as yellow dashed line to tell it apart from match box
The template is cut from the ROI, so DIFF usually finds the ROI position.
With both drawn in red, the Viewer2 ROI overlay looked like a leftover
DIFF box after running CORR.

Co-Authored-By: Claude Opus 5.5 <noreply@anthropic.com>
Claude-Session: https://claude.ai/code/session_019qMwoX24MJmDBfNA6HFSJ8
</commit_message>
<xml_diff>
--- a/docs/REFACTORING_GUIDE.docx
+++ b/docs/REFACTORING_GUIDE.docx
@@ -15502,7 +15502,7 @@
                 <w:sz w:val="18"/>
                 <w:szCs w:val="18"/>
               </w:rPr>
-              <w:t xml:space="preserve">표시 위치</w:t>
+              <w:t xml:space="preserve">모양</w:t>
             </w:r>
           </w:p>
         </w:tc>
@@ -15528,10 +15528,12 @@
             </w:pPr>
             <w:r>
               <w:rPr>
-                <w:sz w:val="18"/>
-                <w:szCs w:val="18"/>
-              </w:rPr>
-              <w:t xml:space="preserve">Viewer1, Viewer2, Navigator</w:t>
+                <w:b/>
+                <w:bCs/>
+                <w:sz w:val="18"/>
+                <w:szCs w:val="18"/>
+              </w:rPr>
+              <w:t xml:space="preserve">노란 점선</w:t>
             </w:r>
           </w:p>
         </w:tc>
@@ -15557,10 +15559,12 @@
             </w:pPr>
             <w:r>
               <w:rPr>
-                <w:sz w:val="18"/>
-                <w:szCs w:val="18"/>
-              </w:rPr>
-              <w:t xml:space="preserve">Viewer2</w:t>
+                <w:b/>
+                <w:bCs/>
+                <w:sz w:val="18"/>
+                <w:szCs w:val="18"/>
+              </w:rPr>
+              <w:t xml:space="preserve">빨간 실선</w:t>
             </w:r>
           </w:p>
         </w:tc>
@@ -15594,7 +15598,7 @@
                 <w:sz w:val="18"/>
                 <w:szCs w:val="18"/>
               </w:rPr>
-              <w:t xml:space="preserve">사라지는 때</w:t>
+              <w:t xml:space="preserve">표시 위치</w:t>
             </w:r>
           </w:p>
         </w:tc>
@@ -15623,7 +15627,7 @@
                 <w:sz w:val="18"/>
                 <w:szCs w:val="18"/>
               </w:rPr>
-              <w:t xml:space="preserve">ROI 취소, 빈 드래그, 새 이미지 열기</w:t>
+              <w:t xml:space="preserve">Viewer1, Viewer2, Navigator</w:t>
             </w:r>
           </w:p>
         </w:tc>
@@ -15652,7 +15656,7 @@
                 <w:sz w:val="18"/>
                 <w:szCs w:val="18"/>
               </w:rPr>
-              <w:t xml:space="preserve">다른 처리를 실행할 때</w:t>
+              <w:t xml:space="preserve">Viewer2</w:t>
             </w:r>
           </w:p>
         </w:tc>
@@ -15686,6 +15690,98 @@
                 <w:sz w:val="18"/>
                 <w:szCs w:val="18"/>
               </w:rPr>
+              <w:t xml:space="preserve">사라지는 때</w:t>
+            </w:r>
+          </w:p>
+        </w:tc>
+        <w:tc>
+          <w:tcPr>
+            <w:tcW w:type="dxa" w:w="4369"/>
+            <w:tcBorders>
+              <w:top w:val="single" w:color="BFBFBF" w:sz="4"/>
+              <w:left w:val="single" w:color="BFBFBF" w:sz="4"/>
+              <w:bottom w:val="single" w:color="BFBFBF" w:sz="4"/>
+              <w:right w:val="single" w:color="BFBFBF" w:sz="4"/>
+            </w:tcBorders>
+            <w:tcMar>
+              <w:top w:type="dxa" w:w="60"/>
+              <w:left w:type="dxa" w:w="100"/>
+              <w:bottom w:type="dxa" w:w="60"/>
+              <w:right w:type="dxa" w:w="100"/>
+            </w:tcMar>
+          </w:tcPr>
+          <w:p>
+            <w:pPr>
+              <w:spacing w:after="0" w:before="0"/>
+            </w:pPr>
+            <w:r>
+              <w:rPr>
+                <w:sz w:val="18"/>
+                <w:szCs w:val="18"/>
+              </w:rPr>
+              <w:t xml:space="preserve">ROI 취소, 빈 드래그, 새 이미지 열기</w:t>
+            </w:r>
+          </w:p>
+        </w:tc>
+        <w:tc>
+          <w:tcPr>
+            <w:tcW w:type="dxa" w:w="3470"/>
+            <w:tcBorders>
+              <w:top w:val="single" w:color="BFBFBF" w:sz="4"/>
+              <w:left w:val="single" w:color="BFBFBF" w:sz="4"/>
+              <w:bottom w:val="single" w:color="BFBFBF" w:sz="4"/>
+              <w:right w:val="single" w:color="BFBFBF" w:sz="4"/>
+            </w:tcBorders>
+            <w:tcMar>
+              <w:top w:type="dxa" w:w="60"/>
+              <w:left w:type="dxa" w:w="100"/>
+              <w:bottom w:type="dxa" w:w="60"/>
+              <w:right w:type="dxa" w:w="100"/>
+            </w:tcMar>
+          </w:tcPr>
+          <w:p>
+            <w:pPr>
+              <w:spacing w:after="0" w:before="0"/>
+            </w:pPr>
+            <w:r>
+              <w:rPr>
+                <w:sz w:val="18"/>
+                <w:szCs w:val="18"/>
+              </w:rPr>
+              <w:t xml:space="preserve">다른 처리를 실행할 때</w:t>
+            </w:r>
+          </w:p>
+        </w:tc>
+      </w:tr>
+      <w:tr>
+        <w:trPr>
+          <w:tblHeader w:val="off"/>
+        </w:trPr>
+        <w:tc>
+          <w:tcPr>
+            <w:tcW w:type="dxa" w:w="1799"/>
+            <w:tcBorders>
+              <w:top w:val="single" w:color="BFBFBF" w:sz="4"/>
+              <w:left w:val="single" w:color="BFBFBF" w:sz="4"/>
+              <w:bottom w:val="single" w:color="BFBFBF" w:sz="4"/>
+              <w:right w:val="single" w:color="BFBFBF" w:sz="4"/>
+            </w:tcBorders>
+            <w:tcMar>
+              <w:top w:type="dxa" w:w="60"/>
+              <w:left w:type="dxa" w:w="100"/>
+              <w:bottom w:type="dxa" w:w="60"/>
+              <w:right w:type="dxa" w:w="100"/>
+            </w:tcMar>
+          </w:tcPr>
+          <w:p>
+            <w:pPr>
+              <w:spacing w:after="0" w:before="0"/>
+            </w:pPr>
+            <w:r>
+              <w:rPr>
+                <w:sz w:val="18"/>
+                <w:szCs w:val="18"/>
+              </w:rPr>
               <w:t xml:space="preserve">다음 처리 입력에 섞이나?</w:t>
             </w:r>
           </w:p>
@@ -15810,6 +15906,54 @@
       </w:r>
       <w:r>
         <w:t xml:space="preserve">ROI가 있으면 Viewer2에도 같은 사각형이 그려지므로, 처리 결과의 어느 부분을 센 것인지 바로 보인다.</w:t>
+      </w:r>
+    </w:p>
+    <w:p>
+      <w:pPr>
+        <w:pBdr>
+          <w:left w:val="single" w:color="F4B400" w:sz="18" w:space="8"/>
+        </w:pBdr>
+        <w:shd w:fill="FFF8E1" w:color="auto" w:val="clear"/>
+        <w:spacing w:after="160" w:before="80"/>
+        <w:ind w:left="240"/>
+      </w:pPr>
+      <w:r>
+        <w:rPr>
+          <w:color w:val="5F4B00"/>
+        </w:rPr>
+        <w:t xml:space="preserve">두 사각형의 모양을 다르게 한 이유 : 템플릿은 ROI를 잘라서 만들기 때문에, DIFF는 보통 ROI와 </w:t>
+      </w:r>
+      <w:r>
+        <w:rPr>
+          <w:b/>
+          <w:bCs/>
+          <w:color w:val="5F4B00"/>
+        </w:rPr>
+        <w:t xml:space="preserve">같은 위치</w:t>
+      </w:r>
+      <w:r>
+        <w:rPr>
+          <w:color w:val="5F4B00"/>
+        </w:rPr>
+        <w:t xml:space="preserve">를 찾는다.</w:t>
+      </w:r>
+      <w:r>
+        <w:br/>
+      </w:r>
+      <w:r>
+        <w:rPr>
+          <w:color w:val="5F4B00"/>
+        </w:rPr>
+        <w:t xml:space="preserve">두 사각형이 같은 빨간색이면 DIFF → CORR 순서로 실행했을 때 Viewer2의 ROI 사각형이</w:t>
+      </w:r>
+      <w:r>
+        <w:br/>
+      </w:r>
+      <w:r>
+        <w:rPr>
+          <w:color w:val="5F4B00"/>
+        </w:rPr>
+        <w:t xml:space="preserve">"지워지지 않은 DIFF 사각형"처럼 보인다. 그래서 ROI는 노란 점선, 매칭 결과는 빨간 실선으로 구분했다.</w:t>
       </w:r>
     </w:p>
     <w:p>

</xml_diff>

<commit_message>
Hide Viewer2 ROI while a template match result is shown
Revert the yellow dashed ROI style. Instead, ProcessingService exposes
IsTemplateMatchResult and UpdateRoiMarks hides only the Viewer2 ROI
overlay for match results, so it is not mistaken for a leftover box.

Co-Authored-By: Claude Opus 5.5 <noreply@anthropic.com>
Claude-Session: https://claude.ai/code/session_019qMwoX24MJmDBfNA6HFSJ8
</commit_message>
<xml_diff>
--- a/docs/REFACTORING_GUIDE.docx
+++ b/docs/REFACTORING_GUIDE.docx
@@ -15252,9 +15252,9 @@
         </w:tblBorders>
       </w:tblPr>
       <w:tblGrid>
-        <w:gridCol w:w="1799"/>
-        <w:gridCol w:w="4369"/>
-        <w:gridCol w:w="3470"/>
+        <w:gridCol w:w="1349"/>
+        <w:gridCol w:w="5686"/>
+        <w:gridCol w:w="2603"/>
       </w:tblGrid>
       <w:tr>
         <w:trPr>
@@ -15262,7 +15262,7 @@
         </w:trPr>
         <w:tc>
           <w:tcPr>
-            <w:tcW w:type="dxa" w:w="1799"/>
+            <w:tcW w:type="dxa" w:w="1349"/>
             <w:tcBorders>
               <w:top w:val="single" w:color="BFBFBF" w:sz="4"/>
               <w:left w:val="single" w:color="BFBFBF" w:sz="4"/>
@@ -15285,7 +15285,7 @@
         </w:tc>
         <w:tc>
           <w:tcPr>
-            <w:tcW w:type="dxa" w:w="4369"/>
+            <w:tcW w:type="dxa" w:w="5686"/>
             <w:tcBorders>
               <w:top w:val="single" w:color="BFBFBF" w:sz="4"/>
               <w:left w:val="single" w:color="BFBFBF" w:sz="4"/>
@@ -15317,7 +15317,7 @@
         </w:tc>
         <w:tc>
           <w:tcPr>
-            <w:tcW w:type="dxa" w:w="3470"/>
+            <w:tcW w:type="dxa" w:w="2603"/>
             <w:tcBorders>
               <w:top w:val="single" w:color="BFBFBF" w:sz="4"/>
               <w:left w:val="single" w:color="BFBFBF" w:sz="4"/>
@@ -15354,7 +15354,7 @@
         </w:trPr>
         <w:tc>
           <w:tcPr>
-            <w:tcW w:type="dxa" w:w="1799"/>
+            <w:tcW w:type="dxa" w:w="1349"/>
             <w:tcBorders>
               <w:top w:val="single" w:color="BFBFBF" w:sz="4"/>
               <w:left w:val="single" w:color="BFBFBF" w:sz="4"/>
@@ -15383,7 +15383,7 @@
         </w:tc>
         <w:tc>
           <w:tcPr>
-            <w:tcW w:type="dxa" w:w="4369"/>
+            <w:tcW w:type="dxa" w:w="5686"/>
             <w:tcBorders>
               <w:top w:val="single" w:color="BFBFBF" w:sz="4"/>
               <w:left w:val="single" w:color="BFBFBF" w:sz="4"/>
@@ -15429,7 +15429,7 @@
         </w:tc>
         <w:tc>
           <w:tcPr>
-            <w:tcW w:type="dxa" w:w="3470"/>
+            <w:tcW w:type="dxa" w:w="2603"/>
             <w:tcBorders>
               <w:top w:val="single" w:color="BFBFBF" w:sz="4"/>
               <w:left w:val="single" w:color="BFBFBF" w:sz="4"/>
@@ -15479,92 +15479,88 @@
         </w:trPr>
         <w:tc>
           <w:tcPr>
-            <w:tcW w:type="dxa" w:w="1799"/>
-            <w:tcBorders>
-              <w:top w:val="single" w:color="BFBFBF" w:sz="4"/>
-              <w:left w:val="single" w:color="BFBFBF" w:sz="4"/>
-              <w:bottom w:val="single" w:color="BFBFBF" w:sz="4"/>
-              <w:right w:val="single" w:color="BFBFBF" w:sz="4"/>
-            </w:tcBorders>
-            <w:tcMar>
-              <w:top w:type="dxa" w:w="60"/>
-              <w:left w:type="dxa" w:w="100"/>
-              <w:bottom w:type="dxa" w:w="60"/>
-              <w:right w:type="dxa" w:w="100"/>
-            </w:tcMar>
-          </w:tcPr>
-          <w:p>
-            <w:pPr>
-              <w:spacing w:after="0" w:before="0"/>
-            </w:pPr>
-            <w:r>
-              <w:rPr>
-                <w:sz w:val="18"/>
-                <w:szCs w:val="18"/>
-              </w:rPr>
-              <w:t xml:space="preserve">모양</w:t>
-            </w:r>
-          </w:p>
-        </w:tc>
-        <w:tc>
-          <w:tcPr>
-            <w:tcW w:type="dxa" w:w="4369"/>
-            <w:tcBorders>
-              <w:top w:val="single" w:color="BFBFBF" w:sz="4"/>
-              <w:left w:val="single" w:color="BFBFBF" w:sz="4"/>
-              <w:bottom w:val="single" w:color="BFBFBF" w:sz="4"/>
-              <w:right w:val="single" w:color="BFBFBF" w:sz="4"/>
-            </w:tcBorders>
-            <w:tcMar>
-              <w:top w:type="dxa" w:w="60"/>
-              <w:left w:type="dxa" w:w="100"/>
-              <w:bottom w:type="dxa" w:w="60"/>
-              <w:right w:type="dxa" w:w="100"/>
-            </w:tcMar>
-          </w:tcPr>
-          <w:p>
-            <w:pPr>
-              <w:spacing w:after="0" w:before="0"/>
-            </w:pPr>
-            <w:r>
-              <w:rPr>
-                <w:b/>
-                <w:bCs/>
-                <w:sz w:val="18"/>
-                <w:szCs w:val="18"/>
-              </w:rPr>
-              <w:t xml:space="preserve">노란 점선</w:t>
-            </w:r>
-          </w:p>
-        </w:tc>
-        <w:tc>
-          <w:tcPr>
-            <w:tcW w:type="dxa" w:w="3470"/>
-            <w:tcBorders>
-              <w:top w:val="single" w:color="BFBFBF" w:sz="4"/>
-              <w:left w:val="single" w:color="BFBFBF" w:sz="4"/>
-              <w:bottom w:val="single" w:color="BFBFBF" w:sz="4"/>
-              <w:right w:val="single" w:color="BFBFBF" w:sz="4"/>
-            </w:tcBorders>
-            <w:tcMar>
-              <w:top w:type="dxa" w:w="60"/>
-              <w:left w:type="dxa" w:w="100"/>
-              <w:bottom w:type="dxa" w:w="60"/>
-              <w:right w:type="dxa" w:w="100"/>
-            </w:tcMar>
-          </w:tcPr>
-          <w:p>
-            <w:pPr>
-              <w:spacing w:after="0" w:before="0"/>
-            </w:pPr>
-            <w:r>
-              <w:rPr>
-                <w:b/>
-                <w:bCs/>
-                <w:sz w:val="18"/>
-                <w:szCs w:val="18"/>
-              </w:rPr>
-              <w:t xml:space="preserve">빨간 실선</w:t>
+            <w:tcW w:type="dxa" w:w="1349"/>
+            <w:tcBorders>
+              <w:top w:val="single" w:color="BFBFBF" w:sz="4"/>
+              <w:left w:val="single" w:color="BFBFBF" w:sz="4"/>
+              <w:bottom w:val="single" w:color="BFBFBF" w:sz="4"/>
+              <w:right w:val="single" w:color="BFBFBF" w:sz="4"/>
+            </w:tcBorders>
+            <w:tcMar>
+              <w:top w:type="dxa" w:w="60"/>
+              <w:left w:type="dxa" w:w="100"/>
+              <w:bottom w:type="dxa" w:w="60"/>
+              <w:right w:type="dxa" w:w="100"/>
+            </w:tcMar>
+          </w:tcPr>
+          <w:p>
+            <w:pPr>
+              <w:spacing w:after="0" w:before="0"/>
+            </w:pPr>
+            <w:r>
+              <w:rPr>
+                <w:sz w:val="18"/>
+                <w:szCs w:val="18"/>
+              </w:rPr>
+              <w:t xml:space="preserve">표시 위치</w:t>
+            </w:r>
+          </w:p>
+        </w:tc>
+        <w:tc>
+          <w:tcPr>
+            <w:tcW w:type="dxa" w:w="5686"/>
+            <w:tcBorders>
+              <w:top w:val="single" w:color="BFBFBF" w:sz="4"/>
+              <w:left w:val="single" w:color="BFBFBF" w:sz="4"/>
+              <w:bottom w:val="single" w:color="BFBFBF" w:sz="4"/>
+              <w:right w:val="single" w:color="BFBFBF" w:sz="4"/>
+            </w:tcBorders>
+            <w:tcMar>
+              <w:top w:type="dxa" w:w="60"/>
+              <w:left w:type="dxa" w:w="100"/>
+              <w:bottom w:type="dxa" w:w="60"/>
+              <w:right w:type="dxa" w:w="100"/>
+            </w:tcMar>
+          </w:tcPr>
+          <w:p>
+            <w:pPr>
+              <w:spacing w:after="0" w:before="0"/>
+            </w:pPr>
+            <w:r>
+              <w:rPr>
+                <w:sz w:val="18"/>
+                <w:szCs w:val="18"/>
+              </w:rPr>
+              <w:t xml:space="preserve">Viewer1, Navigator, Viewer2 (단, 템플릿 매칭 결과일 때 Viewer2에서는 숨김)</w:t>
+            </w:r>
+          </w:p>
+        </w:tc>
+        <w:tc>
+          <w:tcPr>
+            <w:tcW w:type="dxa" w:w="2603"/>
+            <w:tcBorders>
+              <w:top w:val="single" w:color="BFBFBF" w:sz="4"/>
+              <w:left w:val="single" w:color="BFBFBF" w:sz="4"/>
+              <w:bottom w:val="single" w:color="BFBFBF" w:sz="4"/>
+              <w:right w:val="single" w:color="BFBFBF" w:sz="4"/>
+            </w:tcBorders>
+            <w:tcMar>
+              <w:top w:type="dxa" w:w="60"/>
+              <w:left w:type="dxa" w:w="100"/>
+              <w:bottom w:type="dxa" w:w="60"/>
+              <w:right w:type="dxa" w:w="100"/>
+            </w:tcMar>
+          </w:tcPr>
+          <w:p>
+            <w:pPr>
+              <w:spacing w:after="0" w:before="0"/>
+            </w:pPr>
+            <w:r>
+              <w:rPr>
+                <w:sz w:val="18"/>
+                <w:szCs w:val="18"/>
+              </w:rPr>
+              <w:t xml:space="preserve">Viewer2</w:t>
             </w:r>
           </w:p>
         </w:tc>
@@ -15575,88 +15571,88 @@
         </w:trPr>
         <w:tc>
           <w:tcPr>
-            <w:tcW w:type="dxa" w:w="1799"/>
-            <w:tcBorders>
-              <w:top w:val="single" w:color="BFBFBF" w:sz="4"/>
-              <w:left w:val="single" w:color="BFBFBF" w:sz="4"/>
-              <w:bottom w:val="single" w:color="BFBFBF" w:sz="4"/>
-              <w:right w:val="single" w:color="BFBFBF" w:sz="4"/>
-            </w:tcBorders>
-            <w:tcMar>
-              <w:top w:type="dxa" w:w="60"/>
-              <w:left w:type="dxa" w:w="100"/>
-              <w:bottom w:type="dxa" w:w="60"/>
-              <w:right w:type="dxa" w:w="100"/>
-            </w:tcMar>
-          </w:tcPr>
-          <w:p>
-            <w:pPr>
-              <w:spacing w:after="0" w:before="0"/>
-            </w:pPr>
-            <w:r>
-              <w:rPr>
-                <w:sz w:val="18"/>
-                <w:szCs w:val="18"/>
-              </w:rPr>
-              <w:t xml:space="preserve">표시 위치</w:t>
-            </w:r>
-          </w:p>
-        </w:tc>
-        <w:tc>
-          <w:tcPr>
-            <w:tcW w:type="dxa" w:w="4369"/>
-            <w:tcBorders>
-              <w:top w:val="single" w:color="BFBFBF" w:sz="4"/>
-              <w:left w:val="single" w:color="BFBFBF" w:sz="4"/>
-              <w:bottom w:val="single" w:color="BFBFBF" w:sz="4"/>
-              <w:right w:val="single" w:color="BFBFBF" w:sz="4"/>
-            </w:tcBorders>
-            <w:tcMar>
-              <w:top w:type="dxa" w:w="60"/>
-              <w:left w:type="dxa" w:w="100"/>
-              <w:bottom w:type="dxa" w:w="60"/>
-              <w:right w:type="dxa" w:w="100"/>
-            </w:tcMar>
-          </w:tcPr>
-          <w:p>
-            <w:pPr>
-              <w:spacing w:after="0" w:before="0"/>
-            </w:pPr>
-            <w:r>
-              <w:rPr>
-                <w:sz w:val="18"/>
-                <w:szCs w:val="18"/>
-              </w:rPr>
-              <w:t xml:space="preserve">Viewer1, Viewer2, Navigator</w:t>
-            </w:r>
-          </w:p>
-        </w:tc>
-        <w:tc>
-          <w:tcPr>
-            <w:tcW w:type="dxa" w:w="3470"/>
-            <w:tcBorders>
-              <w:top w:val="single" w:color="BFBFBF" w:sz="4"/>
-              <w:left w:val="single" w:color="BFBFBF" w:sz="4"/>
-              <w:bottom w:val="single" w:color="BFBFBF" w:sz="4"/>
-              <w:right w:val="single" w:color="BFBFBF" w:sz="4"/>
-            </w:tcBorders>
-            <w:tcMar>
-              <w:top w:type="dxa" w:w="60"/>
-              <w:left w:type="dxa" w:w="100"/>
-              <w:bottom w:type="dxa" w:w="60"/>
-              <w:right w:type="dxa" w:w="100"/>
-            </w:tcMar>
-          </w:tcPr>
-          <w:p>
-            <w:pPr>
-              <w:spacing w:after="0" w:before="0"/>
-            </w:pPr>
-            <w:r>
-              <w:rPr>
-                <w:sz w:val="18"/>
-                <w:szCs w:val="18"/>
-              </w:rPr>
-              <w:t xml:space="preserve">Viewer2</w:t>
+            <w:tcW w:type="dxa" w:w="1349"/>
+            <w:tcBorders>
+              <w:top w:val="single" w:color="BFBFBF" w:sz="4"/>
+              <w:left w:val="single" w:color="BFBFBF" w:sz="4"/>
+              <w:bottom w:val="single" w:color="BFBFBF" w:sz="4"/>
+              <w:right w:val="single" w:color="BFBFBF" w:sz="4"/>
+            </w:tcBorders>
+            <w:tcMar>
+              <w:top w:type="dxa" w:w="60"/>
+              <w:left w:type="dxa" w:w="100"/>
+              <w:bottom w:type="dxa" w:w="60"/>
+              <w:right w:type="dxa" w:w="100"/>
+            </w:tcMar>
+          </w:tcPr>
+          <w:p>
+            <w:pPr>
+              <w:spacing w:after="0" w:before="0"/>
+            </w:pPr>
+            <w:r>
+              <w:rPr>
+                <w:sz w:val="18"/>
+                <w:szCs w:val="18"/>
+              </w:rPr>
+              <w:t xml:space="preserve">사라지는 때</w:t>
+            </w:r>
+          </w:p>
+        </w:tc>
+        <w:tc>
+          <w:tcPr>
+            <w:tcW w:type="dxa" w:w="5686"/>
+            <w:tcBorders>
+              <w:top w:val="single" w:color="BFBFBF" w:sz="4"/>
+              <w:left w:val="single" w:color="BFBFBF" w:sz="4"/>
+              <w:bottom w:val="single" w:color="BFBFBF" w:sz="4"/>
+              <w:right w:val="single" w:color="BFBFBF" w:sz="4"/>
+            </w:tcBorders>
+            <w:tcMar>
+              <w:top w:type="dxa" w:w="60"/>
+              <w:left w:type="dxa" w:w="100"/>
+              <w:bottom w:type="dxa" w:w="60"/>
+              <w:right w:type="dxa" w:w="100"/>
+            </w:tcMar>
+          </w:tcPr>
+          <w:p>
+            <w:pPr>
+              <w:spacing w:after="0" w:before="0"/>
+            </w:pPr>
+            <w:r>
+              <w:rPr>
+                <w:sz w:val="18"/>
+                <w:szCs w:val="18"/>
+              </w:rPr>
+              <w:t xml:space="preserve">ROI 취소, 빈 드래그, 새 이미지 열기</w:t>
+            </w:r>
+          </w:p>
+        </w:tc>
+        <w:tc>
+          <w:tcPr>
+            <w:tcW w:type="dxa" w:w="2603"/>
+            <w:tcBorders>
+              <w:top w:val="single" w:color="BFBFBF" w:sz="4"/>
+              <w:left w:val="single" w:color="BFBFBF" w:sz="4"/>
+              <w:bottom w:val="single" w:color="BFBFBF" w:sz="4"/>
+              <w:right w:val="single" w:color="BFBFBF" w:sz="4"/>
+            </w:tcBorders>
+            <w:tcMar>
+              <w:top w:type="dxa" w:w="60"/>
+              <w:left w:type="dxa" w:w="100"/>
+              <w:bottom w:type="dxa" w:w="60"/>
+              <w:right w:type="dxa" w:w="100"/>
+            </w:tcMar>
+          </w:tcPr>
+          <w:p>
+            <w:pPr>
+              <w:spacing w:after="0" w:before="0"/>
+            </w:pPr>
+            <w:r>
+              <w:rPr>
+                <w:sz w:val="18"/>
+                <w:szCs w:val="18"/>
+              </w:rPr>
+              <w:t xml:space="preserve">다른 처리를 실행할 때</w:t>
             </w:r>
           </w:p>
         </w:tc>
@@ -15667,99 +15663,7 @@
         </w:trPr>
         <w:tc>
           <w:tcPr>
-            <w:tcW w:type="dxa" w:w="1799"/>
-            <w:tcBorders>
-              <w:top w:val="single" w:color="BFBFBF" w:sz="4"/>
-              <w:left w:val="single" w:color="BFBFBF" w:sz="4"/>
-              <w:bottom w:val="single" w:color="BFBFBF" w:sz="4"/>
-              <w:right w:val="single" w:color="BFBFBF" w:sz="4"/>
-            </w:tcBorders>
-            <w:tcMar>
-              <w:top w:type="dxa" w:w="60"/>
-              <w:left w:type="dxa" w:w="100"/>
-              <w:bottom w:type="dxa" w:w="60"/>
-              <w:right w:type="dxa" w:w="100"/>
-            </w:tcMar>
-          </w:tcPr>
-          <w:p>
-            <w:pPr>
-              <w:spacing w:after="0" w:before="0"/>
-            </w:pPr>
-            <w:r>
-              <w:rPr>
-                <w:sz w:val="18"/>
-                <w:szCs w:val="18"/>
-              </w:rPr>
-              <w:t xml:space="preserve">사라지는 때</w:t>
-            </w:r>
-          </w:p>
-        </w:tc>
-        <w:tc>
-          <w:tcPr>
-            <w:tcW w:type="dxa" w:w="4369"/>
-            <w:tcBorders>
-              <w:top w:val="single" w:color="BFBFBF" w:sz="4"/>
-              <w:left w:val="single" w:color="BFBFBF" w:sz="4"/>
-              <w:bottom w:val="single" w:color="BFBFBF" w:sz="4"/>
-              <w:right w:val="single" w:color="BFBFBF" w:sz="4"/>
-            </w:tcBorders>
-            <w:tcMar>
-              <w:top w:type="dxa" w:w="60"/>
-              <w:left w:type="dxa" w:w="100"/>
-              <w:bottom w:type="dxa" w:w="60"/>
-              <w:right w:type="dxa" w:w="100"/>
-            </w:tcMar>
-          </w:tcPr>
-          <w:p>
-            <w:pPr>
-              <w:spacing w:after="0" w:before="0"/>
-            </w:pPr>
-            <w:r>
-              <w:rPr>
-                <w:sz w:val="18"/>
-                <w:szCs w:val="18"/>
-              </w:rPr>
-              <w:t xml:space="preserve">ROI 취소, 빈 드래그, 새 이미지 열기</w:t>
-            </w:r>
-          </w:p>
-        </w:tc>
-        <w:tc>
-          <w:tcPr>
-            <w:tcW w:type="dxa" w:w="3470"/>
-            <w:tcBorders>
-              <w:top w:val="single" w:color="BFBFBF" w:sz="4"/>
-              <w:left w:val="single" w:color="BFBFBF" w:sz="4"/>
-              <w:bottom w:val="single" w:color="BFBFBF" w:sz="4"/>
-              <w:right w:val="single" w:color="BFBFBF" w:sz="4"/>
-            </w:tcBorders>
-            <w:tcMar>
-              <w:top w:type="dxa" w:w="60"/>
-              <w:left w:type="dxa" w:w="100"/>
-              <w:bottom w:type="dxa" w:w="60"/>
-              <w:right w:type="dxa" w:w="100"/>
-            </w:tcMar>
-          </w:tcPr>
-          <w:p>
-            <w:pPr>
-              <w:spacing w:after="0" w:before="0"/>
-            </w:pPr>
-            <w:r>
-              <w:rPr>
-                <w:sz w:val="18"/>
-                <w:szCs w:val="18"/>
-              </w:rPr>
-              <w:t xml:space="preserve">다른 처리를 실행할 때</w:t>
-            </w:r>
-          </w:p>
-        </w:tc>
-      </w:tr>
-      <w:tr>
-        <w:trPr>
-          <w:tblHeader w:val="off"/>
-        </w:trPr>
-        <w:tc>
-          <w:tcPr>
-            <w:tcW w:type="dxa" w:w="1799"/>
+            <w:tcW w:type="dxa" w:w="1349"/>
             <w:tcBorders>
               <w:top w:val="single" w:color="BFBFBF" w:sz="4"/>
               <w:left w:val="single" w:color="BFBFBF" w:sz="4"/>
@@ -15788,7 +15692,7 @@
         </w:tc>
         <w:tc>
           <w:tcPr>
-            <w:tcW w:type="dxa" w:w="4369"/>
+            <w:tcW w:type="dxa" w:w="5686"/>
             <w:tcBorders>
               <w:top w:val="single" w:color="BFBFBF" w:sz="4"/>
               <w:left w:val="single" w:color="BFBFBF" w:sz="4"/>
@@ -15817,7 +15721,7 @@
         </w:tc>
         <w:tc>
           <w:tcPr>
-            <w:tcW w:type="dxa" w:w="3470"/>
+            <w:tcW w:type="dxa" w:w="2603"/>
             <w:tcBorders>
               <w:top w:val="single" w:color="BFBFBF" w:sz="4"/>
               <w:left w:val="single" w:color="BFBFBF" w:sz="4"/>
@@ -15921,7 +15825,16 @@
         <w:rPr>
           <w:color w:val="5F4B00"/>
         </w:rPr>
-        <w:t xml:space="preserve">두 사각형의 모양을 다르게 한 이유 : 템플릿은 ROI를 잘라서 만들기 때문에, DIFF는 보통 ROI와 </w:t>
+        <w:t xml:space="preserve">Viewer2에서 템플릿 매칭 결과일 때 ROI를 숨기는 이유 : 템플릿은 ROI를 잘라서 만들기 때문에,</w:t>
+      </w:r>
+      <w:r>
+        <w:br/>
+      </w:r>
+      <w:r>
+        <w:rPr>
+          <w:color w:val="5F4B00"/>
+        </w:rPr>
+        <w:t xml:space="preserve">DIFF는 보통 ROI와 </w:t>
       </w:r>
       <w:r>
         <w:rPr>
@@ -15935,7 +15848,7 @@
         <w:rPr>
           <w:color w:val="5F4B00"/>
         </w:rPr>
-        <w:t xml:space="preserve">를 찾는다.</w:t>
+        <w:t xml:space="preserve">를 찾는다. ROI 사각형을 그대로 그리면 DIFF → CORR 순서로 실행했을 때</w:t>
       </w:r>
       <w:r>
         <w:br/>
@@ -15944,7 +15857,7 @@
         <w:rPr>
           <w:color w:val="5F4B00"/>
         </w:rPr>
-        <w:t xml:space="preserve">두 사각형이 같은 빨간색이면 DIFF → CORR 순서로 실행했을 때 Viewer2의 ROI 사각형이</w:t>
+        <w:t xml:space="preserve">ROI 사각형이 "지워지지 않은 DIFF 사각형"처럼 보인다.</w:t>
       </w:r>
       <w:r>
         <w:br/>
@@ -15953,7 +15866,44 @@
         <w:rPr>
           <w:color w:val="5F4B00"/>
         </w:rPr>
-        <w:t xml:space="preserve">"지워지지 않은 DIFF 사각형"처럼 보인다. 그래서 ROI는 노란 점선, 매칭 결과는 빨간 실선으로 구분했다.</w:t>
+        <w:t xml:space="preserve">그래서 </w:t>
+      </w:r>
+      <w:r>
+        <w:rPr>
+          <w:rFonts w:ascii="Consolas" w:eastAsia="맑은 고딕" w:hAnsi="Consolas"/>
+          <w:color w:val="A31515"/>
+          <w:shd w:fill="F2F2F2" w:color="auto" w:val="clear"/>
+        </w:rPr>
+        <w:t xml:space="preserve">ProcessingService.IsTemplateMatchResult</w:t>
+      </w:r>
+      <w:r>
+        <w:rPr>
+          <w:color w:val="5F4B00"/>
+        </w:rPr>
+        <w:t xml:space="preserve"> 가 true이면 </w:t>
+      </w:r>
+      <w:r>
+        <w:rPr>
+          <w:rFonts w:ascii="Consolas" w:eastAsia="맑은 고딕" w:hAnsi="Consolas"/>
+          <w:color w:val="A31515"/>
+          <w:shd w:fill="F2F2F2" w:color="auto" w:val="clear"/>
+        </w:rPr>
+        <w:t xml:space="preserve">UpdateRoiMarks()</w:t>
+      </w:r>
+      <w:r>
+        <w:rPr>
+          <w:color w:val="5F4B00"/>
+        </w:rPr>
+        <w:t xml:space="preserve"> 가 Viewer2의 ROI만 숨긴다.</w:t>
+      </w:r>
+      <w:r>
+        <w:br/>
+      </w:r>
+      <w:r>
+        <w:rPr>
+          <w:color w:val="5F4B00"/>
+        </w:rPr>
+        <w:t xml:space="preserve">(Viewer1, Navigator의 ROI는 템플릿 등록에 필요하므로 계속 표시)</w:t>
       </w:r>
     </w:p>
     <w:p>

</xml_diff>